<commit_message>
docs: simplify judging alignment section
</commit_message>
<xml_diff>
--- a/docs/DFWIT_Checkpoint2_Primary_Submission.docx
+++ b/docs/DFWIT_Checkpoint2_Primary_Submission.docx
@@ -1,6 +1,6 @@
 
 <file path=word/document.xml><?xml version="1.0" encoding="utf-8"?>
-<w:document xmlns:a="http://schemas.openxmlformats.org/drawingml/2006/main" xmlns:ns1="urn:schemas-microsoft-com:vml" xmlns:ns2="urn:schemas-microsoft-com:office:office" xmlns:pic="http://schemas.openxmlformats.org/drawingml/2006/picture" xmlns:r="http://schemas.openxmlformats.org/officeDocument/2006/relationships" xmlns:w="http://schemas.openxmlformats.org/wordprocessingml/2006/main" xmlns:wp="http://schemas.openxmlformats.org/drawingml/2006/wordprocessingDrawing">
+<w:document xmlns:ns1="urn:schemas-microsoft-com:vml" xmlns:ns2="urn:schemas-microsoft-com:office:office" xmlns:ns3="http://schemas.openxmlformats.org/drawingml/2006/wordprocessingDrawing" xmlns:ns4="http://schemas.openxmlformats.org/drawingml/2006/main" xmlns:ns5="http://schemas.openxmlformats.org/drawingml/2006/picture" xmlns:r="http://schemas.openxmlformats.org/officeDocument/2006/relationships" xmlns:w="http://schemas.openxmlformats.org/wordprocessingml/2006/main">
   <w:body>
     <w:bookmarkStart w:id="12" w:name="oncoreconcile-ai"/>
     <w:p>
@@ -411,7 +411,1364 @@
         <w:pStyle w:val="FirstParagraph"/>
       </w:pPr>
       <w:r>
-        <w:t xml:space="preserve">This Checkpoint 2 submission is organized around the DFWIT judging dimensions:</w:t>
+        <w:t xml:space="preserve">This submission is organized to align with the DFWIT judging dimensions:</w:t>
+      </w:r>
+    </w:p>
+    <w:p>
+      <w:pPr>
+        <w:pStyle w:val="Compact"/>
+        <w:numPr>
+          <w:ilvl w:val="0"/>
+          <w:numId w:val="1003"/>
+        </w:numPr>
+      </w:pPr>
+      <w:r>
+        <w:rPr>
+          <w:b/>
+          <w:bCs/>
+        </w:rPr>
+        <w:t xml:space="preserve">Innovation, Business Value &amp; Social Impact:</w:t>
+      </w:r>
+      <w:r>
+        <w:t xml:space="preserve"> </w:t>
+      </w:r>
+      <w:r>
+        <w:t xml:space="preserve">Applies AI-assisted reconciliation to precision-oncology data quality, a high-friction healthcare data problem that affects analytics, research, interoperability, and trustworthy AI readiness.</w:t>
+      </w:r>
+    </w:p>
+    <w:p>
+      <w:pPr>
+        <w:pStyle w:val="Compact"/>
+        <w:numPr>
+          <w:ilvl w:val="0"/>
+          <w:numId w:val="1003"/>
+        </w:numPr>
+      </w:pPr>
+      <w:r>
+        <w:rPr>
+          <w:b/>
+          <w:bCs/>
+        </w:rPr>
+        <w:t xml:space="preserve">Tech Solution, Quality &amp; User Experience:</w:t>
+      </w:r>
+      <w:r>
+        <w:t xml:space="preserve"> </w:t>
+      </w:r>
+      <w:r>
+        <w:t xml:space="preserve">Provides a working FastAPI + React application with guided single-record demos, CSV batch reconciliation, human review, benchmark dashboards, evidence display, and standards-inspired export prototypes.</w:t>
+      </w:r>
+    </w:p>
+    <w:p>
+      <w:pPr>
+        <w:pStyle w:val="Compact"/>
+        <w:numPr>
+          <w:ilvl w:val="0"/>
+          <w:numId w:val="1003"/>
+        </w:numPr>
+      </w:pPr>
+      <w:r>
+        <w:rPr>
+          <w:b/>
+          <w:bCs/>
+        </w:rPr>
+        <w:t xml:space="preserve">Business Development:</w:t>
+      </w:r>
+      <w:r>
+        <w:t xml:space="preserve"> </w:t>
+      </w:r>
+      <w:r>
+        <w:t xml:space="preserve">Positions the product as a biomedical data quality layer for cancer centers, molecular labs, healthcare data platforms, AI teams, and pharma analytics groups, with future services, SaaS, and API paths.</w:t>
+      </w:r>
+    </w:p>
+    <w:p>
+      <w:pPr>
+        <w:pStyle w:val="Compact"/>
+        <w:numPr>
+          <w:ilvl w:val="0"/>
+          <w:numId w:val="1003"/>
+        </w:numPr>
+      </w:pPr>
+      <w:r>
+        <w:rPr>
+          <w:b/>
+          <w:bCs/>
+        </w:rPr>
+        <w:t xml:space="preserve">Presentation:</w:t>
+      </w:r>
+      <w:r>
+        <w:t xml:space="preserve"> </w:t>
+      </w:r>
+      <w:r>
+        <w:t xml:space="preserve">Uses a judge-friendly GUI flow: reconcile a record, show evidence and governance, process a CSV batch, review ambiguous cases, and explain benchmark results from the dashboard.</w:t>
+      </w:r>
+    </w:p>
+    <w:p>
+      <w:r>
+        <w:pict>
+          <ns1:rect style="width:0;height:1.5pt" ns2:hralign="center" ns2:hrstd="t" ns2:hr="t"/>
+        </w:pict>
+      </w:r>
+    </w:p>
+    <w:bookmarkEnd w:id="15"/>
+    <w:bookmarkStart w:id="16" w:name="problem-statement"/>
+    <w:p>
+      <w:pPr>
+        <w:pStyle w:val="Heading2"/>
+      </w:pPr>
+      <w:r>
+        <w:t xml:space="preserve">Problem Statement</w:t>
+      </w:r>
+    </w:p>
+    <w:p>
+      <w:pPr>
+        <w:pStyle w:val="FirstParagraph"/>
+      </w:pPr>
+      <w:r>
+        <w:t xml:space="preserve">Precision oncology data is fragmented across multiple sources:</w:t>
+      </w:r>
+    </w:p>
+    <w:p>
+      <w:pPr>
+        <w:pStyle w:val="Compact"/>
+        <w:numPr>
+          <w:ilvl w:val="0"/>
+          <w:numId w:val="1004"/>
+        </w:numPr>
+      </w:pPr>
+      <w:r>
+        <w:t xml:space="preserve">Electronic Health Records (EHR)</w:t>
+      </w:r>
+    </w:p>
+    <w:p>
+      <w:pPr>
+        <w:pStyle w:val="Compact"/>
+        <w:numPr>
+          <w:ilvl w:val="0"/>
+          <w:numId w:val="1004"/>
+        </w:numPr>
+      </w:pPr>
+      <w:r>
+        <w:t xml:space="preserve">Molecular Diagnostic Laboratories</w:t>
+      </w:r>
+    </w:p>
+    <w:p>
+      <w:pPr>
+        <w:pStyle w:val="Compact"/>
+        <w:numPr>
+          <w:ilvl w:val="0"/>
+          <w:numId w:val="1004"/>
+        </w:numPr>
+      </w:pPr>
+      <w:r>
+        <w:t xml:space="preserve">Clinical Trials</w:t>
+      </w:r>
+    </w:p>
+    <w:p>
+      <w:pPr>
+        <w:pStyle w:val="Compact"/>
+        <w:numPr>
+          <w:ilvl w:val="0"/>
+          <w:numId w:val="1004"/>
+        </w:numPr>
+      </w:pPr>
+      <w:r>
+        <w:t xml:space="preserve">Research Databases</w:t>
+      </w:r>
+    </w:p>
+    <w:p>
+      <w:pPr>
+        <w:pStyle w:val="Compact"/>
+        <w:numPr>
+          <w:ilvl w:val="0"/>
+          <w:numId w:val="1004"/>
+        </w:numPr>
+      </w:pPr>
+      <w:r>
+        <w:t xml:space="preserve">Real-World Evidence Platforms</w:t>
+      </w:r>
+    </w:p>
+    <w:p>
+      <w:pPr>
+        <w:pStyle w:val="Compact"/>
+        <w:numPr>
+          <w:ilvl w:val="0"/>
+          <w:numId w:val="1004"/>
+        </w:numPr>
+      </w:pPr>
+      <w:r>
+        <w:t xml:space="preserve">Healthcare Analytics Systems</w:t>
+      </w:r>
+    </w:p>
+    <w:p>
+      <w:pPr>
+        <w:pStyle w:val="FirstParagraph"/>
+      </w:pPr>
+      <w:r>
+        <w:t xml:space="preserve">The same biological concept frequently appears under different names.</w:t>
+      </w:r>
+    </w:p>
+    <w:tbl>
+      <w:tblPr>
+        <w:tblStyle w:val="Table"/>
+        <w:tblW w:type="auto" w:w="0"/>
+        <w:tblLook w:firstRow="1" w:lastRow="0" w:firstColumn="0" w:lastColumn="0" w:noHBand="0" w:noVBand="0" w:val="0020"/>
+      </w:tblPr>
+      <w:tblGrid>
+        <w:gridCol w:w="3960"/>
+        <w:gridCol w:w="3960"/>
+      </w:tblGrid>
+      <w:tr>
+        <w:trPr>
+          <w:tblHeader w:val="on"/>
+        </w:trPr>
+        <w:tc>
+          <w:tcPr/>
+          <w:p>
+            <w:pPr>
+              <w:pStyle w:val="Compact"/>
+            </w:pPr>
+            <w:r>
+              <w:t xml:space="preserve">Input</w:t>
+            </w:r>
+          </w:p>
+        </w:tc>
+        <w:tc>
+          <w:tcPr/>
+          <w:p>
+            <w:pPr>
+              <w:pStyle w:val="Compact"/>
+            </w:pPr>
+            <w:r>
+              <w:t xml:space="preserve">Canonical Representation</w:t>
+            </w:r>
+          </w:p>
+        </w:tc>
+      </w:tr>
+      <w:tr>
+        <w:tc>
+          <w:tcPr/>
+          <w:p>
+            <w:pPr>
+              <w:pStyle w:val="Compact"/>
+            </w:pPr>
+            <w:r>
+              <w:t xml:space="preserve">HER2</w:t>
+            </w:r>
+          </w:p>
+        </w:tc>
+        <w:tc>
+          <w:tcPr/>
+          <w:p>
+            <w:pPr>
+              <w:pStyle w:val="Compact"/>
+            </w:pPr>
+            <w:r>
+              <w:t xml:space="preserve">ERBB2</w:t>
+            </w:r>
+          </w:p>
+        </w:tc>
+      </w:tr>
+      <w:tr>
+        <w:tc>
+          <w:tcPr/>
+          <w:p>
+            <w:pPr>
+              <w:pStyle w:val="Compact"/>
+            </w:pPr>
+            <w:r>
+              <w:t xml:space="preserve">HER1</w:t>
+            </w:r>
+          </w:p>
+        </w:tc>
+        <w:tc>
+          <w:tcPr/>
+          <w:p>
+            <w:pPr>
+              <w:pStyle w:val="Compact"/>
+            </w:pPr>
+            <w:r>
+              <w:t xml:space="preserve">EGFR</w:t>
+            </w:r>
+          </w:p>
+        </w:tc>
+      </w:tr>
+      <w:tr>
+        <w:tc>
+          <w:tcPr/>
+          <w:p>
+            <w:pPr>
+              <w:pStyle w:val="Compact"/>
+            </w:pPr>
+            <w:r>
+              <w:t xml:space="preserve">p53</w:t>
+            </w:r>
+          </w:p>
+        </w:tc>
+        <w:tc>
+          <w:tcPr/>
+          <w:p>
+            <w:pPr>
+              <w:pStyle w:val="Compact"/>
+            </w:pPr>
+            <w:r>
+              <w:t xml:space="preserve">TP53</w:t>
+            </w:r>
+          </w:p>
+        </w:tc>
+      </w:tr>
+      <w:tr>
+        <w:tc>
+          <w:tcPr/>
+          <w:p>
+            <w:pPr>
+              <w:pStyle w:val="Compact"/>
+            </w:pPr>
+            <w:r>
+              <w:t xml:space="preserve">NSCLC</w:t>
+            </w:r>
+          </w:p>
+        </w:tc>
+        <w:tc>
+          <w:tcPr/>
+          <w:p>
+            <w:pPr>
+              <w:pStyle w:val="Compact"/>
+            </w:pPr>
+            <w:r>
+              <w:t xml:space="preserve">Lung Non-Small Cell Carcinoma</w:t>
+            </w:r>
+          </w:p>
+        </w:tc>
+      </w:tr>
+      <w:tr>
+        <w:tc>
+          <w:tcPr/>
+          <w:p>
+            <w:pPr>
+              <w:pStyle w:val="Compact"/>
+            </w:pPr>
+            <w:r>
+              <w:t xml:space="preserve">Ex19del</w:t>
+            </w:r>
+          </w:p>
+        </w:tc>
+        <w:tc>
+          <w:tcPr/>
+          <w:p>
+            <w:pPr>
+              <w:pStyle w:val="Compact"/>
+            </w:pPr>
+            <w:r>
+              <w:t xml:space="preserve">EGFR Exon 19 Deletion</w:t>
+            </w:r>
+          </w:p>
+        </w:tc>
+      </w:tr>
+      <w:tr>
+        <w:tc>
+          <w:tcPr/>
+          <w:p>
+            <w:pPr>
+              <w:pStyle w:val="Compact"/>
+            </w:pPr>
+            <w:r>
+              <w:t xml:space="preserve">FLT3 ITD</w:t>
+            </w:r>
+          </w:p>
+        </w:tc>
+        <w:tc>
+          <w:tcPr/>
+          <w:p>
+            <w:pPr>
+              <w:pStyle w:val="Compact"/>
+            </w:pPr>
+            <w:r>
+              <w:t xml:space="preserve">FLT3 Internal Tandem Duplication</w:t>
+            </w:r>
+          </w:p>
+        </w:tc>
+      </w:tr>
+    </w:tbl>
+    <w:p>
+      <w:pPr>
+        <w:pStyle w:val="BodyText"/>
+      </w:pPr>
+      <w:r>
+        <w:t xml:space="preserve">These inconsistencies create challenges for:</w:t>
+      </w:r>
+    </w:p>
+    <w:p>
+      <w:pPr>
+        <w:pStyle w:val="Compact"/>
+        <w:numPr>
+          <w:ilvl w:val="0"/>
+          <w:numId w:val="1005"/>
+        </w:numPr>
+      </w:pPr>
+      <w:r>
+        <w:t xml:space="preserve">Biomarker analytics</w:t>
+      </w:r>
+    </w:p>
+    <w:p>
+      <w:pPr>
+        <w:pStyle w:val="Compact"/>
+        <w:numPr>
+          <w:ilvl w:val="0"/>
+          <w:numId w:val="1005"/>
+        </w:numPr>
+      </w:pPr>
+      <w:r>
+        <w:t xml:space="preserve">Cohort generation</w:t>
+      </w:r>
+    </w:p>
+    <w:p>
+      <w:pPr>
+        <w:pStyle w:val="Compact"/>
+        <w:numPr>
+          <w:ilvl w:val="0"/>
+          <w:numId w:val="1005"/>
+        </w:numPr>
+      </w:pPr>
+      <w:r>
+        <w:t xml:space="preserve">Clinical trial matching</w:t>
+      </w:r>
+    </w:p>
+    <w:p>
+      <w:pPr>
+        <w:pStyle w:val="Compact"/>
+        <w:numPr>
+          <w:ilvl w:val="0"/>
+          <w:numId w:val="1005"/>
+        </w:numPr>
+      </w:pPr>
+      <w:r>
+        <w:t xml:space="preserve">Data integration</w:t>
+      </w:r>
+    </w:p>
+    <w:p>
+      <w:pPr>
+        <w:pStyle w:val="Compact"/>
+        <w:numPr>
+          <w:ilvl w:val="0"/>
+          <w:numId w:val="1005"/>
+        </w:numPr>
+      </w:pPr>
+      <w:r>
+        <w:t xml:space="preserve">AI model development</w:t>
+      </w:r>
+    </w:p>
+    <w:p>
+      <w:pPr>
+        <w:pStyle w:val="Compact"/>
+        <w:numPr>
+          <w:ilvl w:val="0"/>
+          <w:numId w:val="1005"/>
+        </w:numPr>
+      </w:pPr>
+      <w:r>
+        <w:t xml:space="preserve">Healthcare interoperability</w:t>
+      </w:r>
+    </w:p>
+    <w:p>
+      <w:pPr>
+        <w:pStyle w:val="FirstParagraph"/>
+      </w:pPr>
+      <w:r>
+        <w:t xml:space="preserve">Organizations often spend substantial effort manually harmonizing data before it becomes useful.</w:t>
+      </w:r>
+    </w:p>
+    <w:p>
+      <w:r>
+        <w:pict>
+          <ns1:rect style="width:0;height:1.5pt" ns2:hralign="center" ns2:hrstd="t" ns2:hr="t"/>
+        </w:pict>
+      </w:r>
+    </w:p>
+    <w:bookmarkEnd w:id="16"/>
+    <w:bookmarkStart w:id="17" w:name="why-this-matters"/>
+    <w:p>
+      <w:pPr>
+        <w:pStyle w:val="Heading2"/>
+      </w:pPr>
+      <w:r>
+        <w:t xml:space="preserve">Why This Matters</w:t>
+      </w:r>
+    </w:p>
+    <w:p>
+      <w:pPr>
+        <w:pStyle w:val="FirstParagraph"/>
+      </w:pPr>
+      <w:r>
+        <w:t xml:space="preserve">Healthcare organizations are increasingly adopting AI. However:</w:t>
+      </w:r>
+    </w:p>
+    <w:p>
+      <w:pPr>
+        <w:pStyle w:val="BlockText"/>
+      </w:pPr>
+      <w:r>
+        <w:rPr>
+          <w:b/>
+          <w:bCs/>
+        </w:rPr>
+        <w:t xml:space="preserve">Trustworthy AI requires trustworthy data.</w:t>
+      </w:r>
+    </w:p>
+    <w:p>
+      <w:pPr>
+        <w:pStyle w:val="FirstParagraph"/>
+      </w:pPr>
+      <w:r>
+        <w:t xml:space="preserve">Poorly standardized oncology data can lead to:</w:t>
+      </w:r>
+    </w:p>
+    <w:p>
+      <w:pPr>
+        <w:pStyle w:val="Compact"/>
+        <w:numPr>
+          <w:ilvl w:val="0"/>
+          <w:numId w:val="1006"/>
+        </w:numPr>
+      </w:pPr>
+      <w:r>
+        <w:t xml:space="preserve">Reduced data quality</w:t>
+      </w:r>
+    </w:p>
+    <w:p>
+      <w:pPr>
+        <w:pStyle w:val="Compact"/>
+        <w:numPr>
+          <w:ilvl w:val="0"/>
+          <w:numId w:val="1006"/>
+        </w:numPr>
+      </w:pPr>
+      <w:r>
+        <w:t xml:space="preserve">Increased manual effort</w:t>
+      </w:r>
+    </w:p>
+    <w:p>
+      <w:pPr>
+        <w:pStyle w:val="Compact"/>
+        <w:numPr>
+          <w:ilvl w:val="0"/>
+          <w:numId w:val="1006"/>
+        </w:numPr>
+      </w:pPr>
+      <w:r>
+        <w:t xml:space="preserve">Inconsistent analytics</w:t>
+      </w:r>
+    </w:p>
+    <w:p>
+      <w:pPr>
+        <w:pStyle w:val="Compact"/>
+        <w:numPr>
+          <w:ilvl w:val="0"/>
+          <w:numId w:val="1006"/>
+        </w:numPr>
+      </w:pPr>
+      <w:r>
+        <w:t xml:space="preserve">Lower interoperability</w:t>
+      </w:r>
+    </w:p>
+    <w:p>
+      <w:pPr>
+        <w:pStyle w:val="Compact"/>
+        <w:numPr>
+          <w:ilvl w:val="0"/>
+          <w:numId w:val="1006"/>
+        </w:numPr>
+      </w:pPr>
+      <w:r>
+        <w:t xml:space="preserve">Reduced confidence in AI systems</w:t>
+      </w:r>
+    </w:p>
+    <w:p>
+      <w:pPr>
+        <w:pStyle w:val="FirstParagraph"/>
+      </w:pPr>
+      <w:r>
+        <w:t xml:space="preserve">OncoReconcile AI focuses on improving data quality before downstream analytics and AI workflows.</w:t>
+      </w:r>
+    </w:p>
+    <w:p>
+      <w:r>
+        <w:pict>
+          <ns1:rect style="width:0;height:1.5pt" ns2:hralign="center" ns2:hrstd="t" ns2:hr="t"/>
+        </w:pict>
+      </w:r>
+    </w:p>
+    <w:bookmarkEnd w:id="17"/>
+    <w:bookmarkStart w:id="21" w:name="solution-overview"/>
+    <w:p>
+      <w:pPr>
+        <w:pStyle w:val="Heading2"/>
+      </w:pPr>
+      <w:r>
+        <w:t xml:space="preserve">Solution Overview</w:t>
+      </w:r>
+    </w:p>
+    <w:p>
+      <w:pPr>
+        <w:pStyle w:val="SourceCode"/>
+      </w:pPr>
+      <w:r>
+        <w:rPr>
+          <w:rStyle w:val="VerbatimChar"/>
+        </w:rPr>
+        <w:t xml:space="preserve">Disease / Gene / Variant Input</w:t>
+      </w:r>
+      <w:r>
+        <w:br/>
+      </w:r>
+      <w:r>
+        <w:rPr>
+          <w:rStyle w:val="VerbatimChar"/>
+        </w:rPr>
+        <w:t xml:space="preserve">                |</w:t>
+      </w:r>
+      <w:r>
+        <w:br/>
+      </w:r>
+      <w:r>
+        <w:rPr>
+          <w:rStyle w:val="VerbatimChar"/>
+        </w:rPr>
+        <w:t xml:space="preserve">                v</w:t>
+      </w:r>
+      <w:r>
+        <w:br/>
+      </w:r>
+      <w:r>
+        <w:rPr>
+          <w:rStyle w:val="VerbatimChar"/>
+        </w:rPr>
+        <w:t xml:space="preserve">       Entity Resolution</w:t>
+      </w:r>
+      <w:r>
+        <w:br/>
+      </w:r>
+      <w:r>
+        <w:rPr>
+          <w:rStyle w:val="VerbatimChar"/>
+        </w:rPr>
+        <w:t xml:space="preserve">                |</w:t>
+      </w:r>
+      <w:r>
+        <w:br/>
+      </w:r>
+      <w:r>
+        <w:rPr>
+          <w:rStyle w:val="VerbatimChar"/>
+        </w:rPr>
+        <w:t xml:space="preserve">                v</w:t>
+      </w:r>
+      <w:r>
+        <w:br/>
+      </w:r>
+      <w:r>
+        <w:rPr>
+          <w:rStyle w:val="VerbatimChar"/>
+        </w:rPr>
+        <w:t xml:space="preserve">       Evidence Retrieval</w:t>
+      </w:r>
+      <w:r>
+        <w:br/>
+      </w:r>
+      <w:r>
+        <w:rPr>
+          <w:rStyle w:val="VerbatimChar"/>
+        </w:rPr>
+        <w:t xml:space="preserve">                |</w:t>
+      </w:r>
+      <w:r>
+        <w:br/>
+      </w:r>
+      <w:r>
+        <w:rPr>
+          <w:rStyle w:val="VerbatimChar"/>
+        </w:rPr>
+        <w:t xml:space="preserve">                v</w:t>
+      </w:r>
+      <w:r>
+        <w:br/>
+      </w:r>
+      <w:r>
+        <w:rPr>
+          <w:rStyle w:val="VerbatimChar"/>
+        </w:rPr>
+        <w:t xml:space="preserve">       Confidence Scoring</w:t>
+      </w:r>
+      <w:r>
+        <w:br/>
+      </w:r>
+      <w:r>
+        <w:rPr>
+          <w:rStyle w:val="VerbatimChar"/>
+        </w:rPr>
+        <w:t xml:space="preserve">                |</w:t>
+      </w:r>
+      <w:r>
+        <w:br/>
+      </w:r>
+      <w:r>
+        <w:rPr>
+          <w:rStyle w:val="VerbatimChar"/>
+        </w:rPr>
+        <w:t xml:space="preserve">                v</w:t>
+      </w:r>
+      <w:r>
+        <w:br/>
+      </w:r>
+      <w:r>
+        <w:rPr>
+          <w:rStyle w:val="VerbatimChar"/>
+        </w:rPr>
+        <w:t xml:space="preserve">       Governance Decision</w:t>
+      </w:r>
+      <w:r>
+        <w:br/>
+      </w:r>
+      <w:r>
+        <w:rPr>
+          <w:rStyle w:val="VerbatimChar"/>
+        </w:rPr>
+        <w:t xml:space="preserve">        /       |        \</w:t>
+      </w:r>
+      <w:r>
+        <w:br/>
+      </w:r>
+      <w:r>
+        <w:rPr>
+          <w:rStyle w:val="VerbatimChar"/>
+        </w:rPr>
+        <w:t xml:space="preserve">AUTO_RECONCILE REVIEW_REQUIRED CANNOT_RECONCILE</w:t>
+      </w:r>
+      <w:r>
+        <w:br/>
+      </w:r>
+      <w:r>
+        <w:rPr>
+          <w:rStyle w:val="VerbatimChar"/>
+        </w:rPr>
+        <w:t xml:space="preserve">                |</w:t>
+      </w:r>
+      <w:r>
+        <w:br/>
+      </w:r>
+      <w:r>
+        <w:rPr>
+          <w:rStyle w:val="VerbatimChar"/>
+        </w:rPr>
+        <w:t xml:space="preserve">                v</w:t>
+      </w:r>
+      <w:r>
+        <w:br/>
+      </w:r>
+      <w:r>
+        <w:rPr>
+          <w:rStyle w:val="VerbatimChar"/>
+        </w:rPr>
+        <w:t xml:space="preserve">         Human Review</w:t>
+      </w:r>
+      <w:r>
+        <w:br/>
+      </w:r>
+      <w:r>
+        <w:rPr>
+          <w:rStyle w:val="VerbatimChar"/>
+        </w:rPr>
+        <w:t xml:space="preserve">                |</w:t>
+      </w:r>
+      <w:r>
+        <w:br/>
+      </w:r>
+      <w:r>
+        <w:rPr>
+          <w:rStyle w:val="VerbatimChar"/>
+        </w:rPr>
+        <w:t xml:space="preserve">                v</w:t>
+      </w:r>
+      <w:r>
+        <w:br/>
+      </w:r>
+      <w:r>
+        <w:rPr>
+          <w:rStyle w:val="VerbatimChar"/>
+        </w:rPr>
+        <w:t xml:space="preserve">          Curated Output</w:t>
+      </w:r>
+      <w:r>
+        <w:br/>
+      </w:r>
+      <w:r>
+        <w:rPr>
+          <w:rStyle w:val="VerbatimChar"/>
+        </w:rPr>
+        <w:t xml:space="preserve">                |</w:t>
+      </w:r>
+      <w:r>
+        <w:br/>
+      </w:r>
+      <w:r>
+        <w:rPr>
+          <w:rStyle w:val="VerbatimChar"/>
+        </w:rPr>
+        <w:t xml:space="preserve">                v</w:t>
+      </w:r>
+      <w:r>
+        <w:br/>
+      </w:r>
+      <w:r>
+        <w:rPr>
+          <w:rStyle w:val="VerbatimChar"/>
+        </w:rPr>
+        <w:t xml:space="preserve">     FHIR / OMOP / Analytics</w:t>
+      </w:r>
+    </w:p>
+    <w:p>
+      <w:pPr>
+        <w:pStyle w:val="FirstParagraph"/>
+        <w:jc w:val="center"/>
+      </w:pPr>
+      <w:r>
+        <w:drawing>
+          <ns3:inline>
+            <ns3:extent cx="5303520" cy="3683000"/>
+            <ns3:effectExtent b="0" l="0" r="0" t="0"/>
+            <ns3:docPr descr="" title="" id="19" name="Picture"/>
+            <ns4:graphic>
+              <ns4:graphicData uri="http://schemas.openxmlformats.org/drawingml/2006/picture">
+                <ns5:pic>
+                  <ns5:nvPicPr>
+                    <ns5:cNvPr descr="screenshots/02-single-record-reconciliation.png" id="20" name="Picture"/>
+                    <ns5:cNvPicPr>
+                      <ns4:picLocks noChangeArrowheads="1" noChangeAspect="1"/>
+                    </ns5:cNvPicPr>
+                  </ns5:nvPicPr>
+                  <ns5:blipFill>
+                    <ns4:blip r:embed="rId18"/>
+                    <ns4:stretch>
+                      <ns4:fillRect/>
+                    </ns4:stretch>
+                  </ns5:blipFill>
+                  <ns5:spPr bwMode="auto">
+                    <ns4:xfrm>
+                      <ns4:off x="0" y="0"/>
+                      <ns4:ext cx="5303520" cy="3683000"/>
+                    </ns4:xfrm>
+                    <ns4:prstGeom prst="rect">
+                      <ns4:avLst/>
+                    </ns4:prstGeom>
+                    <ns4:noFill/>
+                    <ns4:ln w="9525">
+                      <ns4:noFill/>
+                      <ns4:headEnd/>
+                      <ns4:tailEnd/>
+                    </ns4:ln>
+                  </ns5:spPr>
+                </ns5:pic>
+              </ns4:graphicData>
+            </ns4:graphic>
+          </ns3:inline>
+        </w:drawing>
+      </w:r>
+    </w:p>
+    <w:p>
+      <w:pPr>
+        <w:pStyle w:val="BodyText"/>
+      </w:pPr>
+      <w:r>
+        <w:rPr>
+          <w:b/>
+          <w:bCs/>
+        </w:rPr>
+        <w:t xml:space="preserve">Figure 1. Single Record Reconciliation</w:t>
+      </w:r>
+    </w:p>
+    <w:p>
+      <w:r>
+        <w:pict>
+          <ns1:rect style="width:0;height:1.5pt" ns2:hralign="center" ns2:hrstd="t" ns2:hr="t"/>
+        </w:pict>
+      </w:r>
+    </w:p>
+    <w:bookmarkEnd w:id="21"/>
+    <w:bookmarkStart w:id="28" w:name="core-platform-capabilities"/>
+    <w:p>
+      <w:pPr>
+        <w:pStyle w:val="Heading2"/>
+      </w:pPr>
+      <w:r>
+        <w:t xml:space="preserve">Core Platform Capabilities</w:t>
+      </w:r>
+    </w:p>
+    <w:bookmarkStart w:id="22" w:name="reconciliation-engine"/>
+    <w:p>
+      <w:pPr>
+        <w:pStyle w:val="Heading3"/>
+      </w:pPr>
+      <w:r>
+        <w:t xml:space="preserve">Reconciliation Engine</w:t>
+      </w:r>
+    </w:p>
+    <w:p>
+      <w:pPr>
+        <w:pStyle w:val="Compact"/>
+        <w:numPr>
+          <w:ilvl w:val="0"/>
+          <w:numId w:val="1007"/>
+        </w:numPr>
+      </w:pPr>
+      <w:r>
+        <w:t xml:space="preserve">Disease reconciliation</w:t>
+      </w:r>
+    </w:p>
+    <w:p>
+      <w:pPr>
+        <w:pStyle w:val="Compact"/>
+        <w:numPr>
+          <w:ilvl w:val="0"/>
+          <w:numId w:val="1007"/>
+        </w:numPr>
+      </w:pPr>
+      <w:r>
+        <w:t xml:space="preserve">Gene reconciliation</w:t>
+      </w:r>
+    </w:p>
+    <w:p>
+      <w:pPr>
+        <w:pStyle w:val="Compact"/>
+        <w:numPr>
+          <w:ilvl w:val="0"/>
+          <w:numId w:val="1007"/>
+        </w:numPr>
+      </w:pPr>
+      <w:r>
+        <w:t xml:space="preserve">Variant reconciliation</w:t>
+      </w:r>
+    </w:p>
+    <w:p>
+      <w:pPr>
+        <w:pStyle w:val="Compact"/>
+        <w:numPr>
+          <w:ilvl w:val="0"/>
+          <w:numId w:val="1007"/>
+        </w:numPr>
+      </w:pPr>
+      <w:r>
+        <w:t xml:space="preserve">Alias normalization</w:t>
+      </w:r>
+    </w:p>
+    <w:p>
+      <w:pPr>
+        <w:pStyle w:val="Compact"/>
+        <w:numPr>
+          <w:ilvl w:val="0"/>
+          <w:numId w:val="1007"/>
+        </w:numPr>
+      </w:pPr>
+      <w:r>
+        <w:t xml:space="preserve">Fuzzy matching</w:t>
+      </w:r>
+    </w:p>
+    <w:p>
+      <w:pPr>
+        <w:pStyle w:val="Compact"/>
+        <w:numPr>
+          <w:ilvl w:val="0"/>
+          <w:numId w:val="1007"/>
+        </w:numPr>
+      </w:pPr>
+      <w:r>
+        <w:t xml:space="preserve">Compound disease-gene-variant reasoning</w:t>
+      </w:r>
+    </w:p>
+    <w:bookmarkEnd w:id="22"/>
+    <w:bookmarkStart w:id="23" w:name="evidence-intelligence"/>
+    <w:p>
+      <w:pPr>
+        <w:pStyle w:val="Heading3"/>
+      </w:pPr>
+      <w:r>
+        <w:t xml:space="preserve">Evidence Intelligence</w:t>
+      </w:r>
+    </w:p>
+    <w:p>
+      <w:pPr>
+        <w:pStyle w:val="Compact"/>
+        <w:numPr>
+          <w:ilvl w:val="0"/>
+          <w:numId w:val="1008"/>
+        </w:numPr>
+      </w:pPr>
+      <w:r>
+        <w:t xml:space="preserve">Local oncology catalogs</w:t>
+      </w:r>
+    </w:p>
+    <w:p>
+      <w:pPr>
+        <w:pStyle w:val="Compact"/>
+        <w:numPr>
+          <w:ilvl w:val="0"/>
+          <w:numId w:val="1008"/>
+        </w:numPr>
+      </w:pPr>
+      <w:r>
+        <w:t xml:space="preserve">MyVariant.info integration</w:t>
+      </w:r>
+    </w:p>
+    <w:p>
+      <w:pPr>
+        <w:pStyle w:val="Compact"/>
+        <w:numPr>
+          <w:ilvl w:val="0"/>
+          <w:numId w:val="1008"/>
+        </w:numPr>
+      </w:pPr>
+      <w:r>
+        <w:t xml:space="preserve">ClinVar integration</w:t>
+      </w:r>
+    </w:p>
+    <w:p>
+      <w:pPr>
+        <w:pStyle w:val="Compact"/>
+        <w:numPr>
+          <w:ilvl w:val="0"/>
+          <w:numId w:val="1008"/>
+        </w:numPr>
+      </w:pPr>
+      <w:r>
+        <w:t xml:space="preserve">CIViC integration</w:t>
+      </w:r>
+    </w:p>
+    <w:p>
+      <w:pPr>
+        <w:pStyle w:val="Compact"/>
+        <w:numPr>
+          <w:ilvl w:val="0"/>
+          <w:numId w:val="1008"/>
+        </w:numPr>
+      </w:pPr>
+      <w:r>
+        <w:t xml:space="preserve">ClinGen reference support</w:t>
+      </w:r>
+    </w:p>
+    <w:bookmarkEnd w:id="23"/>
+    <w:bookmarkStart w:id="24" w:name="explainable-ai"/>
+    <w:p>
+      <w:pPr>
+        <w:pStyle w:val="Heading3"/>
+      </w:pPr>
+      <w:r>
+        <w:t xml:space="preserve">Explainable AI</w:t>
+      </w:r>
+    </w:p>
+    <w:p>
+      <w:pPr>
+        <w:pStyle w:val="Compact"/>
+        <w:numPr>
+          <w:ilvl w:val="0"/>
+          <w:numId w:val="1009"/>
+        </w:numPr>
+      </w:pPr>
+      <w:r>
+        <w:t xml:space="preserve">Confidence scores</w:t>
+      </w:r>
+    </w:p>
+    <w:p>
+      <w:pPr>
+        <w:pStyle w:val="Compact"/>
+        <w:numPr>
+          <w:ilvl w:val="0"/>
+          <w:numId w:val="1009"/>
+        </w:numPr>
+      </w:pPr>
+      <w:r>
+        <w:t xml:space="preserve">Audit trails</w:t>
+      </w:r>
+    </w:p>
+    <w:p>
+      <w:pPr>
+        <w:pStyle w:val="Compact"/>
+        <w:numPr>
+          <w:ilvl w:val="0"/>
+          <w:numId w:val="1009"/>
+        </w:numPr>
+      </w:pPr>
+      <w:r>
+        <w:t xml:space="preserve">Evidence packages</w:t>
+      </w:r>
+    </w:p>
+    <w:p>
+      <w:pPr>
+        <w:pStyle w:val="Compact"/>
+        <w:numPr>
+          <w:ilvl w:val="0"/>
+          <w:numId w:val="1009"/>
+        </w:numPr>
+      </w:pPr>
+      <w:r>
+        <w:t xml:space="preserve">Alternative candidate suggestions</w:t>
+      </w:r>
+    </w:p>
+    <w:p>
+      <w:pPr>
+        <w:pStyle w:val="Compact"/>
+        <w:numPr>
+          <w:ilvl w:val="0"/>
+          <w:numId w:val="1009"/>
+        </w:numPr>
+      </w:pPr>
+      <w:r>
+        <w:t xml:space="preserve">Provenance tracking</w:t>
+      </w:r>
+    </w:p>
+    <w:bookmarkEnd w:id="24"/>
+    <w:bookmarkStart w:id="25" w:name="human-governance"/>
+    <w:p>
+      <w:pPr>
+        <w:pStyle w:val="Heading3"/>
+      </w:pPr>
+      <w:r>
+        <w:t xml:space="preserve">Human Governance</w:t>
+      </w:r>
+    </w:p>
+    <w:p>
+      <w:pPr>
+        <w:pStyle w:val="Compact"/>
+        <w:numPr>
+          <w:ilvl w:val="0"/>
+          <w:numId w:val="1010"/>
+        </w:numPr>
+      </w:pPr>
+      <w:r>
+        <w:t xml:space="preserve">Review queue</w:t>
+      </w:r>
+    </w:p>
+    <w:p>
+      <w:pPr>
+        <w:pStyle w:val="Compact"/>
+        <w:numPr>
+          <w:ilvl w:val="0"/>
+          <w:numId w:val="1010"/>
+        </w:numPr>
+      </w:pPr>
+      <w:r>
+        <w:t xml:space="preserve">Reviewer decisions</w:t>
+      </w:r>
+    </w:p>
+    <w:p>
+      <w:pPr>
+        <w:pStyle w:val="Compact"/>
+        <w:numPr>
+          <w:ilvl w:val="0"/>
+          <w:numId w:val="1010"/>
+        </w:numPr>
+      </w:pPr>
+      <w:r>
+        <w:t xml:space="preserve">Adjudication workflow</w:t>
+      </w:r>
+    </w:p>
+    <w:p>
+      <w:pPr>
+        <w:pStyle w:val="Compact"/>
+        <w:numPr>
+          <w:ilvl w:val="0"/>
+          <w:numId w:val="1010"/>
+        </w:numPr>
+      </w:pPr>
+      <w:r>
+        <w:t xml:space="preserve">Review reopening</w:t>
+      </w:r>
+    </w:p>
+    <w:p>
+      <w:pPr>
+        <w:pStyle w:val="Compact"/>
+        <w:numPr>
+          <w:ilvl w:val="0"/>
+          <w:numId w:val="1010"/>
+        </w:numPr>
+      </w:pPr>
+      <w:r>
+        <w:t xml:space="preserve">Governance metrics</w:t>
+      </w:r>
+    </w:p>
+    <w:bookmarkEnd w:id="25"/>
+    <w:bookmarkStart w:id="26" w:name="interoperability"/>
+    <w:p>
+      <w:pPr>
+        <w:pStyle w:val="Heading3"/>
+      </w:pPr>
+      <w:r>
+        <w:t xml:space="preserve">Interoperability</w:t>
+      </w:r>
+    </w:p>
+    <w:p>
+      <w:pPr>
+        <w:pStyle w:val="Compact"/>
+        <w:numPr>
+          <w:ilvl w:val="0"/>
+          <w:numId w:val="1011"/>
+        </w:numPr>
+      </w:pPr>
+      <w:r>
+        <w:t xml:space="preserve">FHIR export</w:t>
+      </w:r>
+    </w:p>
+    <w:p>
+      <w:pPr>
+        <w:pStyle w:val="Compact"/>
+        <w:numPr>
+          <w:ilvl w:val="0"/>
+          <w:numId w:val="1011"/>
+        </w:numPr>
+      </w:pPr>
+      <w:r>
+        <w:t xml:space="preserve">OMOP export</w:t>
+      </w:r>
+    </w:p>
+    <w:p>
+      <w:pPr>
+        <w:pStyle w:val="Compact"/>
+        <w:numPr>
+          <w:ilvl w:val="0"/>
+          <w:numId w:val="1011"/>
+        </w:numPr>
+      </w:pPr>
+      <w:r>
+        <w:t xml:space="preserve">Knowledge graph export</w:t>
+      </w:r>
+    </w:p>
+    <w:p>
+      <w:pPr>
+        <w:pStyle w:val="Compact"/>
+        <w:numPr>
+          <w:ilvl w:val="0"/>
+          <w:numId w:val="1011"/>
+        </w:numPr>
+      </w:pPr>
+      <w:r>
+        <w:t xml:space="preserve">VRS-inspired structures</w:t>
+      </w:r>
+    </w:p>
+    <w:p>
+      <w:pPr>
+        <w:pStyle w:val="Compact"/>
+        <w:numPr>
+          <w:ilvl w:val="0"/>
+          <w:numId w:val="1011"/>
+        </w:numPr>
+      </w:pPr>
+      <w:r>
+        <w:t xml:space="preserve">Cat-VRS-inspired structures</w:t>
+      </w:r>
+    </w:p>
+    <w:p>
+      <w:pPr>
+        <w:pStyle w:val="Compact"/>
+        <w:numPr>
+          <w:ilvl w:val="0"/>
+          <w:numId w:val="1011"/>
+        </w:numPr>
+      </w:pPr>
+      <w:r>
+        <w:t xml:space="preserve">VA-Spec-inspired provenance</w:t>
+      </w:r>
+    </w:p>
+    <w:bookmarkEnd w:id="26"/>
+    <w:bookmarkStart w:id="27" w:name="analytics"/>
+    <w:p>
+      <w:pPr>
+        <w:pStyle w:val="Heading3"/>
+      </w:pPr>
+      <w:r>
+        <w:t xml:space="preserve">Analytics</w:t>
+      </w:r>
+    </w:p>
+    <w:p>
+      <w:pPr>
+        <w:pStyle w:val="Compact"/>
+        <w:numPr>
+          <w:ilvl w:val="0"/>
+          <w:numId w:val="1012"/>
+        </w:numPr>
+      </w:pPr>
+      <w:r>
+        <w:t xml:space="preserve">Evaluation dashboard</w:t>
+      </w:r>
+    </w:p>
+    <w:p>
+      <w:pPr>
+        <w:pStyle w:val="Compact"/>
+        <w:numPr>
+          <w:ilvl w:val="0"/>
+          <w:numId w:val="1012"/>
+        </w:numPr>
+      </w:pPr>
+      <w:r>
+        <w:t xml:space="preserve">Benchmark reporting</w:t>
+      </w:r>
+    </w:p>
+    <w:p>
+      <w:pPr>
+        <w:pStyle w:val="Compact"/>
+        <w:numPr>
+          <w:ilvl w:val="0"/>
+          <w:numId w:val="1012"/>
+        </w:numPr>
+      </w:pPr>
+      <w:r>
+        <w:t xml:space="preserve">Safety reporting</w:t>
+      </w:r>
+    </w:p>
+    <w:p>
+      <w:pPr>
+        <w:pStyle w:val="Compact"/>
+        <w:numPr>
+          <w:ilvl w:val="0"/>
+          <w:numId w:val="1012"/>
+        </w:numPr>
+      </w:pPr>
+      <w:r>
+        <w:t xml:space="preserve">Review metrics</w:t>
+      </w:r>
+    </w:p>
+    <w:p>
+      <w:pPr>
+        <w:pStyle w:val="Compact"/>
+        <w:numPr>
+          <w:ilvl w:val="0"/>
+          <w:numId w:val="1012"/>
+        </w:numPr>
+      </w:pPr>
+      <w:r>
+        <w:t xml:space="preserve">Data quality metrics</w:t>
+      </w:r>
+    </w:p>
+    <w:p>
+      <w:r>
+        <w:pict>
+          <ns1:rect style="width:0;height:1.5pt" ns2:hralign="center" ns2:hrstd="t" ns2:hr="t"/>
+        </w:pict>
+      </w:r>
+    </w:p>
+    <w:bookmarkEnd w:id="27"/>
+    <w:bookmarkEnd w:id="28"/>
+    <w:bookmarkStart w:id="29" w:name="gui-demonstration-workflow"/>
+    <w:p>
+      <w:pPr>
+        <w:pStyle w:val="Heading2"/>
+      </w:pPr>
+      <w:r>
+        <w:t xml:space="preserve">GUI Demonstration Workflow</w:t>
+      </w:r>
+    </w:p>
+    <w:p>
+      <w:pPr>
+        <w:pStyle w:val="FirstParagraph"/>
+      </w:pPr>
+      <w:r>
+        <w:t xml:space="preserve">The current frontend is organized into five judge-facing tabs:</w:t>
       </w:r>
     </w:p>
     <w:tbl>
@@ -436,18 +1793,18 @@
               <w:pStyle w:val="Compact"/>
             </w:pPr>
             <w:r>
-              <w:t xml:space="preserve">Judging Dimension</w:t>
-            </w:r>
-          </w:p>
-        </w:tc>
-        <w:tc>
-          <w:tcPr/>
-          <w:p>
-            <w:pPr>
-              <w:pStyle w:val="Compact"/>
-            </w:pPr>
-            <w:r>
-              <w:t xml:space="preserve">How OncoReconcile AI Addresses It</w:t>
+              <w:t xml:space="preserve">GUI Tab</w:t>
+            </w:r>
+          </w:p>
+        </w:tc>
+        <w:tc>
+          <w:tcPr/>
+          <w:p>
+            <w:pPr>
+              <w:pStyle w:val="Compact"/>
+            </w:pPr>
+            <w:r>
+              <w:t xml:space="preserve">What Judges Can See</w:t>
             </w:r>
           </w:p>
         </w:tc>
@@ -460,18 +1817,18 @@
               <w:pStyle w:val="Compact"/>
             </w:pPr>
             <w:r>
-              <w:t xml:space="preserve">Innovation, Business Value &amp; Social Impact</w:t>
-            </w:r>
-          </w:p>
-        </w:tc>
-        <w:tc>
-          <w:tcPr/>
-          <w:p>
-            <w:pPr>
-              <w:pStyle w:val="Compact"/>
-            </w:pPr>
-            <w:r>
-              <w:t xml:space="preserve">Applies AI-assisted reconciliation to precision-oncology data quality, a high-friction healthcare data problem that affects analytics, research, interoperability, and trustworthy AI readiness.</w:t>
+              <w:t xml:space="preserve">Single Record</w:t>
+            </w:r>
+          </w:p>
+        </w:tc>
+        <w:tc>
+          <w:tcPr/>
+          <w:p>
+            <w:pPr>
+              <w:pStyle w:val="Compact"/>
+            </w:pPr>
+            <w:r>
+              <w:t xml:space="preserve">Manual disease/gene/variant input, featured demo case, guided examples, canonical output, confidence score, evidence badges, decision rationale, alternatives, audit trail, and standards/export actions.</w:t>
             </w:r>
           </w:p>
         </w:tc>
@@ -484,18 +1841,18 @@
               <w:pStyle w:val="Compact"/>
             </w:pPr>
             <w:r>
-              <w:t xml:space="preserve">Tech Solution, Quality &amp; User Experience</w:t>
-            </w:r>
-          </w:p>
-        </w:tc>
-        <w:tc>
-          <w:tcPr/>
-          <w:p>
-            <w:pPr>
-              <w:pStyle w:val="Compact"/>
-            </w:pPr>
-            <w:r>
-              <w:t xml:space="preserve">Provides a working FastAPI + React application with guided single-record demos, CSV batch reconciliation, human review, benchmark dashboards, evidence display, and standards-inspired export prototypes.</w:t>
+              <w:t xml:space="preserve">CSV Upload</w:t>
+            </w:r>
+          </w:p>
+        </w:tc>
+        <w:tc>
+          <w:tcPr/>
+          <w:p>
+            <w:pPr>
+              <w:pStyle w:val="Compact"/>
+            </w:pPr>
+            <w:r>
+              <w:t xml:space="preserve">Sample CSV, downloadable demo CSV, upload-and-reconcile workflow, batch status summary, and expandable result cards for each row.</w:t>
             </w:r>
           </w:p>
         </w:tc>
@@ -508,18 +1865,18 @@
               <w:pStyle w:val="Compact"/>
             </w:pPr>
             <w:r>
-              <w:t xml:space="preserve">Business Development</w:t>
-            </w:r>
-          </w:p>
-        </w:tc>
-        <w:tc>
-          <w:tcPr/>
-          <w:p>
-            <w:pPr>
-              <w:pStyle w:val="Compact"/>
-            </w:pPr>
-            <w:r>
-              <w:t xml:space="preserve">Positions the product as a biomedical data quality layer for cancer centers, molecular labs, healthcare data platforms, AI teams, and pharma analytics groups, with future services, SaaS, and API paths.</w:t>
+              <w:t xml:space="preserve">Review Queue</w:t>
+            </w:r>
+          </w:p>
+        </w:tc>
+        <w:tc>
+          <w:tcPr/>
+          <w:p>
+            <w:pPr>
+              <w:pStyle w:val="Compact"/>
+            </w:pPr>
+            <w:r>
+              <w:t xml:space="preserve">Seeded review examples, pending/reviewed filters, curator ID, evidence/candidate indicators, approve/reject/edit/reopen actions, review history, and adjudication support.</w:t>
             </w:r>
           </w:p>
         </w:tc>
@@ -532,23 +1889,55 @@
               <w:pStyle w:val="Compact"/>
             </w:pPr>
             <w:r>
-              <w:t xml:space="preserve">Presentation</w:t>
-            </w:r>
-          </w:p>
-        </w:tc>
-        <w:tc>
-          <w:tcPr/>
-          <w:p>
-            <w:pPr>
-              <w:pStyle w:val="Compact"/>
-            </w:pPr>
-            <w:r>
-              <w:t xml:space="preserve">Uses a judge-friendly GUI flow: reconcile a record, show evidence and governance, process a CSV batch, review ambiguous cases, and explain benchmark results from the dashboard.</w:t>
+              <w:t xml:space="preserve">Benchmark</w:t>
+            </w:r>
+          </w:p>
+        </w:tc>
+        <w:tc>
+          <w:tcPr/>
+          <w:p>
+            <w:pPr>
+              <w:pStyle w:val="Compact"/>
+            </w:pPr>
+            <w:r>
+              <w:t xml:space="preserve">Accuracy, coverage, review rate, total cases, status counts, evidence counts, review-decision counts, and benchmark-source explanation.</w:t>
+            </w:r>
+          </w:p>
+        </w:tc>
+      </w:tr>
+      <w:tr>
+        <w:tc>
+          <w:tcPr/>
+          <w:p>
+            <w:pPr>
+              <w:pStyle w:val="Compact"/>
+            </w:pPr>
+            <w:r>
+              <w:t xml:space="preserve">Evaluation</w:t>
+            </w:r>
+          </w:p>
+        </w:tc>
+        <w:tc>
+          <w:tcPr/>
+          <w:p>
+            <w:pPr>
+              <w:pStyle w:val="Compact"/>
+            </w:pPr>
+            <w:r>
+              <w:t xml:space="preserve">Visual KPI cards, status distribution, accuracy/coverage chart, review-rate chart, false auto-accept rate, evidence-source chart, reviewer agreement, review-decision chart, and failure breakdown.</w:t>
             </w:r>
           </w:p>
         </w:tc>
       </w:tr>
     </w:tbl>
+    <w:p>
+      <w:pPr>
+        <w:pStyle w:val="BodyText"/>
+      </w:pPr>
+      <w:r>
+        <w:t xml:space="preserve">This workflow directly supports the presentation score because the demo can move from a messy oncology input to a governed, explainable, benchmarked output without requiring judges to inspect code.</w:t>
+      </w:r>
+    </w:p>
     <w:p>
       <w:r>
         <w:pict>
@@ -556,14 +1945,307 @@
         </w:pict>
       </w:r>
     </w:p>
-    <w:bookmarkEnd w:id="15"/>
-    <w:bookmarkStart w:id="16" w:name="problem-statement"/>
+    <w:bookmarkEnd w:id="29"/>
+    <w:bookmarkStart w:id="30" w:name="technical-architecture"/>
     <w:p>
       <w:pPr>
         <w:pStyle w:val="Heading2"/>
       </w:pPr>
       <w:r>
-        <w:t xml:space="preserve">Problem Statement</w:t>
+        <w:t xml:space="preserve">Technical Architecture</w:t>
+      </w:r>
+    </w:p>
+    <w:p>
+      <w:pPr>
+        <w:pStyle w:val="SourceCode"/>
+      </w:pPr>
+      <w:r>
+        <w:rPr>
+          <w:rStyle w:val="VerbatimChar"/>
+        </w:rPr>
+        <w:t xml:space="preserve">Clinical Data Sources</w:t>
+      </w:r>
+      <w:r>
+        <w:br/>
+      </w:r>
+      <w:r>
+        <w:rPr>
+          <w:rStyle w:val="VerbatimChar"/>
+        </w:rPr>
+        <w:t xml:space="preserve">Genomic Data Sources</w:t>
+      </w:r>
+      <w:r>
+        <w:br/>
+      </w:r>
+      <w:r>
+        <w:rPr>
+          <w:rStyle w:val="VerbatimChar"/>
+        </w:rPr>
+        <w:t xml:space="preserve">Laboratory Data Sources</w:t>
+      </w:r>
+      <w:r>
+        <w:br/>
+      </w:r>
+      <w:r>
+        <w:br/>
+      </w:r>
+      <w:r>
+        <w:rPr>
+          <w:rStyle w:val="VerbatimChar"/>
+        </w:rPr>
+        <w:t xml:space="preserve">            |</w:t>
+      </w:r>
+      <w:r>
+        <w:br/>
+      </w:r>
+      <w:r>
+        <w:rPr>
+          <w:rStyle w:val="VerbatimChar"/>
+        </w:rPr>
+        <w:t xml:space="preserve">            v</w:t>
+      </w:r>
+      <w:r>
+        <w:br/>
+      </w:r>
+      <w:r>
+        <w:br/>
+      </w:r>
+      <w:r>
+        <w:rPr>
+          <w:rStyle w:val="VerbatimChar"/>
+        </w:rPr>
+        <w:t xml:space="preserve">    Normalization Layer</w:t>
+      </w:r>
+      <w:r>
+        <w:br/>
+      </w:r>
+      <w:r>
+        <w:br/>
+      </w:r>
+      <w:r>
+        <w:rPr>
+          <w:rStyle w:val="VerbatimChar"/>
+        </w:rPr>
+        <w:t xml:space="preserve">            |</w:t>
+      </w:r>
+      <w:r>
+        <w:br/>
+      </w:r>
+      <w:r>
+        <w:rPr>
+          <w:rStyle w:val="VerbatimChar"/>
+        </w:rPr>
+        <w:t xml:space="preserve">            v</w:t>
+      </w:r>
+      <w:r>
+        <w:br/>
+      </w:r>
+      <w:r>
+        <w:br/>
+      </w:r>
+      <w:r>
+        <w:rPr>
+          <w:rStyle w:val="VerbatimChar"/>
+        </w:rPr>
+        <w:t xml:space="preserve">   Entity Resolution Layer</w:t>
+      </w:r>
+      <w:r>
+        <w:br/>
+      </w:r>
+      <w:r>
+        <w:br/>
+      </w:r>
+      <w:r>
+        <w:rPr>
+          <w:rStyle w:val="VerbatimChar"/>
+        </w:rPr>
+        <w:t xml:space="preserve">            |</w:t>
+      </w:r>
+      <w:r>
+        <w:br/>
+      </w:r>
+      <w:r>
+        <w:rPr>
+          <w:rStyle w:val="VerbatimChar"/>
+        </w:rPr>
+        <w:t xml:space="preserve">            v</w:t>
+      </w:r>
+      <w:r>
+        <w:br/>
+      </w:r>
+      <w:r>
+        <w:br/>
+      </w:r>
+      <w:r>
+        <w:rPr>
+          <w:rStyle w:val="VerbatimChar"/>
+        </w:rPr>
+        <w:t xml:space="preserve">    Evidence Retrieval</w:t>
+      </w:r>
+      <w:r>
+        <w:br/>
+      </w:r>
+      <w:r>
+        <w:br/>
+      </w:r>
+      <w:r>
+        <w:rPr>
+          <w:rStyle w:val="VerbatimChar"/>
+        </w:rPr>
+        <w:t xml:space="preserve">            |</w:t>
+      </w:r>
+      <w:r>
+        <w:br/>
+      </w:r>
+      <w:r>
+        <w:rPr>
+          <w:rStyle w:val="VerbatimChar"/>
+        </w:rPr>
+        <w:t xml:space="preserve">            v</w:t>
+      </w:r>
+      <w:r>
+        <w:br/>
+      </w:r>
+      <w:r>
+        <w:br/>
+      </w:r>
+      <w:r>
+        <w:rPr>
+          <w:rStyle w:val="VerbatimChar"/>
+        </w:rPr>
+        <w:t xml:space="preserve">     Confidence Engine</w:t>
+      </w:r>
+      <w:r>
+        <w:br/>
+      </w:r>
+      <w:r>
+        <w:br/>
+      </w:r>
+      <w:r>
+        <w:rPr>
+          <w:rStyle w:val="VerbatimChar"/>
+        </w:rPr>
+        <w:t xml:space="preserve">            |</w:t>
+      </w:r>
+      <w:r>
+        <w:br/>
+      </w:r>
+      <w:r>
+        <w:rPr>
+          <w:rStyle w:val="VerbatimChar"/>
+        </w:rPr>
+        <w:t xml:space="preserve">            v</w:t>
+      </w:r>
+      <w:r>
+        <w:br/>
+      </w:r>
+      <w:r>
+        <w:br/>
+      </w:r>
+      <w:r>
+        <w:rPr>
+          <w:rStyle w:val="VerbatimChar"/>
+        </w:rPr>
+        <w:t xml:space="preserve">     Governance Engine</w:t>
+      </w:r>
+      <w:r>
+        <w:br/>
+      </w:r>
+      <w:r>
+        <w:br/>
+      </w:r>
+      <w:r>
+        <w:rPr>
+          <w:rStyle w:val="VerbatimChar"/>
+        </w:rPr>
+        <w:t xml:space="preserve">            |</w:t>
+      </w:r>
+      <w:r>
+        <w:br/>
+      </w:r>
+      <w:r>
+        <w:rPr>
+          <w:rStyle w:val="VerbatimChar"/>
+        </w:rPr>
+        <w:t xml:space="preserve">            v</w:t>
+      </w:r>
+      <w:r>
+        <w:br/>
+      </w:r>
+      <w:r>
+        <w:br/>
+      </w:r>
+      <w:r>
+        <w:rPr>
+          <w:rStyle w:val="VerbatimChar"/>
+        </w:rPr>
+        <w:t xml:space="preserve">      Human Review</w:t>
+      </w:r>
+      <w:r>
+        <w:br/>
+      </w:r>
+      <w:r>
+        <w:br/>
+      </w:r>
+      <w:r>
+        <w:rPr>
+          <w:rStyle w:val="VerbatimChar"/>
+        </w:rPr>
+        <w:t xml:space="preserve">            |</w:t>
+      </w:r>
+      <w:r>
+        <w:br/>
+      </w:r>
+      <w:r>
+        <w:rPr>
+          <w:rStyle w:val="VerbatimChar"/>
+        </w:rPr>
+        <w:t xml:space="preserve">            v</w:t>
+      </w:r>
+      <w:r>
+        <w:br/>
+      </w:r>
+      <w:r>
+        <w:br/>
+      </w:r>
+      <w:r>
+        <w:rPr>
+          <w:rStyle w:val="VerbatimChar"/>
+        </w:rPr>
+        <w:t xml:space="preserve">    FHIR / OMOP Export</w:t>
+      </w:r>
+      <w:r>
+        <w:br/>
+      </w:r>
+      <w:r>
+        <w:br/>
+      </w:r>
+      <w:r>
+        <w:rPr>
+          <w:rStyle w:val="VerbatimChar"/>
+        </w:rPr>
+        <w:t xml:space="preserve">            |</w:t>
+      </w:r>
+      <w:r>
+        <w:br/>
+      </w:r>
+      <w:r>
+        <w:rPr>
+          <w:rStyle w:val="VerbatimChar"/>
+        </w:rPr>
+        <w:t xml:space="preserve">            v</w:t>
+      </w:r>
+      <w:r>
+        <w:br/>
+      </w:r>
+      <w:r>
+        <w:br/>
+      </w:r>
+      <w:r>
+        <w:rPr>
+          <w:rStyle w:val="VerbatimChar"/>
+        </w:rPr>
+        <w:t xml:space="preserve"> Analytics &amp; AI Applications</w:t>
       </w:r>
     </w:p>
     <w:p>
@@ -571,357 +2253,7 @@
         <w:pStyle w:val="FirstParagraph"/>
       </w:pPr>
       <w:r>
-        <w:t xml:space="preserve">Precision oncology data is fragmented across multiple sources:</w:t>
-      </w:r>
-    </w:p>
-    <w:p>
-      <w:pPr>
-        <w:pStyle w:val="Compact"/>
-        <w:numPr>
-          <w:ilvl w:val="0"/>
-          <w:numId w:val="1003"/>
-        </w:numPr>
-      </w:pPr>
-      <w:r>
-        <w:t xml:space="preserve">Electronic Health Records (EHR)</w:t>
-      </w:r>
-    </w:p>
-    <w:p>
-      <w:pPr>
-        <w:pStyle w:val="Compact"/>
-        <w:numPr>
-          <w:ilvl w:val="0"/>
-          <w:numId w:val="1003"/>
-        </w:numPr>
-      </w:pPr>
-      <w:r>
-        <w:t xml:space="preserve">Molecular Diagnostic Laboratories</w:t>
-      </w:r>
-    </w:p>
-    <w:p>
-      <w:pPr>
-        <w:pStyle w:val="Compact"/>
-        <w:numPr>
-          <w:ilvl w:val="0"/>
-          <w:numId w:val="1003"/>
-        </w:numPr>
-      </w:pPr>
-      <w:r>
-        <w:t xml:space="preserve">Clinical Trials</w:t>
-      </w:r>
-    </w:p>
-    <w:p>
-      <w:pPr>
-        <w:pStyle w:val="Compact"/>
-        <w:numPr>
-          <w:ilvl w:val="0"/>
-          <w:numId w:val="1003"/>
-        </w:numPr>
-      </w:pPr>
-      <w:r>
-        <w:t xml:space="preserve">Research Databases</w:t>
-      </w:r>
-    </w:p>
-    <w:p>
-      <w:pPr>
-        <w:pStyle w:val="Compact"/>
-        <w:numPr>
-          <w:ilvl w:val="0"/>
-          <w:numId w:val="1003"/>
-        </w:numPr>
-      </w:pPr>
-      <w:r>
-        <w:t xml:space="preserve">Real-World Evidence Platforms</w:t>
-      </w:r>
-    </w:p>
-    <w:p>
-      <w:pPr>
-        <w:pStyle w:val="Compact"/>
-        <w:numPr>
-          <w:ilvl w:val="0"/>
-          <w:numId w:val="1003"/>
-        </w:numPr>
-      </w:pPr>
-      <w:r>
-        <w:t xml:space="preserve">Healthcare Analytics Systems</w:t>
-      </w:r>
-    </w:p>
-    <w:p>
-      <w:pPr>
-        <w:pStyle w:val="FirstParagraph"/>
-      </w:pPr>
-      <w:r>
-        <w:t xml:space="preserve">The same biological concept frequently appears under different names.</w:t>
-      </w:r>
-    </w:p>
-    <w:tbl>
-      <w:tblPr>
-        <w:tblStyle w:val="Table"/>
-        <w:tblW w:type="auto" w:w="0"/>
-        <w:tblLook w:firstRow="1" w:lastRow="0" w:firstColumn="0" w:lastColumn="0" w:noHBand="0" w:noVBand="0" w:val="0020"/>
-      </w:tblPr>
-      <w:tblGrid>
-        <w:gridCol w:w="3960"/>
-        <w:gridCol w:w="3960"/>
-      </w:tblGrid>
-      <w:tr>
-        <w:trPr>
-          <w:tblHeader w:val="on"/>
-        </w:trPr>
-        <w:tc>
-          <w:tcPr/>
-          <w:p>
-            <w:pPr>
-              <w:pStyle w:val="Compact"/>
-            </w:pPr>
-            <w:r>
-              <w:t xml:space="preserve">Input</w:t>
-            </w:r>
-          </w:p>
-        </w:tc>
-        <w:tc>
-          <w:tcPr/>
-          <w:p>
-            <w:pPr>
-              <w:pStyle w:val="Compact"/>
-            </w:pPr>
-            <w:r>
-              <w:t xml:space="preserve">Canonical Representation</w:t>
-            </w:r>
-          </w:p>
-        </w:tc>
-      </w:tr>
-      <w:tr>
-        <w:tc>
-          <w:tcPr/>
-          <w:p>
-            <w:pPr>
-              <w:pStyle w:val="Compact"/>
-            </w:pPr>
-            <w:r>
-              <w:t xml:space="preserve">HER2</w:t>
-            </w:r>
-          </w:p>
-        </w:tc>
-        <w:tc>
-          <w:tcPr/>
-          <w:p>
-            <w:pPr>
-              <w:pStyle w:val="Compact"/>
-            </w:pPr>
-            <w:r>
-              <w:t xml:space="preserve">ERBB2</w:t>
-            </w:r>
-          </w:p>
-        </w:tc>
-      </w:tr>
-      <w:tr>
-        <w:tc>
-          <w:tcPr/>
-          <w:p>
-            <w:pPr>
-              <w:pStyle w:val="Compact"/>
-            </w:pPr>
-            <w:r>
-              <w:t xml:space="preserve">HER1</w:t>
-            </w:r>
-          </w:p>
-        </w:tc>
-        <w:tc>
-          <w:tcPr/>
-          <w:p>
-            <w:pPr>
-              <w:pStyle w:val="Compact"/>
-            </w:pPr>
-            <w:r>
-              <w:t xml:space="preserve">EGFR</w:t>
-            </w:r>
-          </w:p>
-        </w:tc>
-      </w:tr>
-      <w:tr>
-        <w:tc>
-          <w:tcPr/>
-          <w:p>
-            <w:pPr>
-              <w:pStyle w:val="Compact"/>
-            </w:pPr>
-            <w:r>
-              <w:t xml:space="preserve">p53</w:t>
-            </w:r>
-          </w:p>
-        </w:tc>
-        <w:tc>
-          <w:tcPr/>
-          <w:p>
-            <w:pPr>
-              <w:pStyle w:val="Compact"/>
-            </w:pPr>
-            <w:r>
-              <w:t xml:space="preserve">TP53</w:t>
-            </w:r>
-          </w:p>
-        </w:tc>
-      </w:tr>
-      <w:tr>
-        <w:tc>
-          <w:tcPr/>
-          <w:p>
-            <w:pPr>
-              <w:pStyle w:val="Compact"/>
-            </w:pPr>
-            <w:r>
-              <w:t xml:space="preserve">NSCLC</w:t>
-            </w:r>
-          </w:p>
-        </w:tc>
-        <w:tc>
-          <w:tcPr/>
-          <w:p>
-            <w:pPr>
-              <w:pStyle w:val="Compact"/>
-            </w:pPr>
-            <w:r>
-              <w:t xml:space="preserve">Lung Non-Small Cell Carcinoma</w:t>
-            </w:r>
-          </w:p>
-        </w:tc>
-      </w:tr>
-      <w:tr>
-        <w:tc>
-          <w:tcPr/>
-          <w:p>
-            <w:pPr>
-              <w:pStyle w:val="Compact"/>
-            </w:pPr>
-            <w:r>
-              <w:t xml:space="preserve">Ex19del</w:t>
-            </w:r>
-          </w:p>
-        </w:tc>
-        <w:tc>
-          <w:tcPr/>
-          <w:p>
-            <w:pPr>
-              <w:pStyle w:val="Compact"/>
-            </w:pPr>
-            <w:r>
-              <w:t xml:space="preserve">EGFR Exon 19 Deletion</w:t>
-            </w:r>
-          </w:p>
-        </w:tc>
-      </w:tr>
-      <w:tr>
-        <w:tc>
-          <w:tcPr/>
-          <w:p>
-            <w:pPr>
-              <w:pStyle w:val="Compact"/>
-            </w:pPr>
-            <w:r>
-              <w:t xml:space="preserve">FLT3 ITD</w:t>
-            </w:r>
-          </w:p>
-        </w:tc>
-        <w:tc>
-          <w:tcPr/>
-          <w:p>
-            <w:pPr>
-              <w:pStyle w:val="Compact"/>
-            </w:pPr>
-            <w:r>
-              <w:t xml:space="preserve">FLT3 Internal Tandem Duplication</w:t>
-            </w:r>
-          </w:p>
-        </w:tc>
-      </w:tr>
-    </w:tbl>
-    <w:p>
-      <w:pPr>
-        <w:pStyle w:val="BodyText"/>
-      </w:pPr>
-      <w:r>
-        <w:t xml:space="preserve">These inconsistencies create challenges for:</w:t>
-      </w:r>
-    </w:p>
-    <w:p>
-      <w:pPr>
-        <w:pStyle w:val="Compact"/>
-        <w:numPr>
-          <w:ilvl w:val="0"/>
-          <w:numId w:val="1004"/>
-        </w:numPr>
-      </w:pPr>
-      <w:r>
-        <w:t xml:space="preserve">Biomarker analytics</w:t>
-      </w:r>
-    </w:p>
-    <w:p>
-      <w:pPr>
-        <w:pStyle w:val="Compact"/>
-        <w:numPr>
-          <w:ilvl w:val="0"/>
-          <w:numId w:val="1004"/>
-        </w:numPr>
-      </w:pPr>
-      <w:r>
-        <w:t xml:space="preserve">Cohort generation</w:t>
-      </w:r>
-    </w:p>
-    <w:p>
-      <w:pPr>
-        <w:pStyle w:val="Compact"/>
-        <w:numPr>
-          <w:ilvl w:val="0"/>
-          <w:numId w:val="1004"/>
-        </w:numPr>
-      </w:pPr>
-      <w:r>
-        <w:t xml:space="preserve">Clinical trial matching</w:t>
-      </w:r>
-    </w:p>
-    <w:p>
-      <w:pPr>
-        <w:pStyle w:val="Compact"/>
-        <w:numPr>
-          <w:ilvl w:val="0"/>
-          <w:numId w:val="1004"/>
-        </w:numPr>
-      </w:pPr>
-      <w:r>
-        <w:t xml:space="preserve">Data integration</w:t>
-      </w:r>
-    </w:p>
-    <w:p>
-      <w:pPr>
-        <w:pStyle w:val="Compact"/>
-        <w:numPr>
-          <w:ilvl w:val="0"/>
-          <w:numId w:val="1004"/>
-        </w:numPr>
-      </w:pPr>
-      <w:r>
-        <w:t xml:space="preserve">AI model development</w:t>
-      </w:r>
-    </w:p>
-    <w:p>
-      <w:pPr>
-        <w:pStyle w:val="Compact"/>
-        <w:numPr>
-          <w:ilvl w:val="0"/>
-          <w:numId w:val="1004"/>
-        </w:numPr>
-      </w:pPr>
-      <w:r>
-        <w:t xml:space="preserve">Healthcare interoperability</w:t>
-      </w:r>
-    </w:p>
-    <w:p>
-      <w:pPr>
-        <w:pStyle w:val="FirstParagraph"/>
-      </w:pPr>
-      <w:r>
-        <w:t xml:space="preserve">Organizations often spend substantial effort manually harmonizing data before it becomes useful.</w:t>
+        <w:t xml:space="preserve">The architecture separates deterministic normalization, evidence discovery, confidence assessment, governance, and export. This separation supports traceability and allows enterprise teams to integrate the platform into existing oncology data pipelines without making automated clinical decisions.</w:t>
       </w:r>
     </w:p>
     <w:p>
@@ -931,1385 +2263,6 @@
         </w:pict>
       </w:r>
     </w:p>
-    <w:bookmarkEnd w:id="16"/>
-    <w:bookmarkStart w:id="17" w:name="why-this-matters"/>
-    <w:p>
-      <w:pPr>
-        <w:pStyle w:val="Heading2"/>
-      </w:pPr>
-      <w:r>
-        <w:t xml:space="preserve">Why This Matters</w:t>
-      </w:r>
-    </w:p>
-    <w:p>
-      <w:pPr>
-        <w:pStyle w:val="FirstParagraph"/>
-      </w:pPr>
-      <w:r>
-        <w:t xml:space="preserve">Healthcare organizations are increasingly adopting AI. However:</w:t>
-      </w:r>
-    </w:p>
-    <w:p>
-      <w:pPr>
-        <w:pStyle w:val="BlockText"/>
-      </w:pPr>
-      <w:r>
-        <w:rPr>
-          <w:b/>
-          <w:bCs/>
-        </w:rPr>
-        <w:t xml:space="preserve">Trustworthy AI requires trustworthy data.</w:t>
-      </w:r>
-    </w:p>
-    <w:p>
-      <w:pPr>
-        <w:pStyle w:val="FirstParagraph"/>
-      </w:pPr>
-      <w:r>
-        <w:t xml:space="preserve">Poorly standardized oncology data can lead to:</w:t>
-      </w:r>
-    </w:p>
-    <w:p>
-      <w:pPr>
-        <w:pStyle w:val="Compact"/>
-        <w:numPr>
-          <w:ilvl w:val="0"/>
-          <w:numId w:val="1005"/>
-        </w:numPr>
-      </w:pPr>
-      <w:r>
-        <w:t xml:space="preserve">Reduced data quality</w:t>
-      </w:r>
-    </w:p>
-    <w:p>
-      <w:pPr>
-        <w:pStyle w:val="Compact"/>
-        <w:numPr>
-          <w:ilvl w:val="0"/>
-          <w:numId w:val="1005"/>
-        </w:numPr>
-      </w:pPr>
-      <w:r>
-        <w:t xml:space="preserve">Increased manual effort</w:t>
-      </w:r>
-    </w:p>
-    <w:p>
-      <w:pPr>
-        <w:pStyle w:val="Compact"/>
-        <w:numPr>
-          <w:ilvl w:val="0"/>
-          <w:numId w:val="1005"/>
-        </w:numPr>
-      </w:pPr>
-      <w:r>
-        <w:t xml:space="preserve">Inconsistent analytics</w:t>
-      </w:r>
-    </w:p>
-    <w:p>
-      <w:pPr>
-        <w:pStyle w:val="Compact"/>
-        <w:numPr>
-          <w:ilvl w:val="0"/>
-          <w:numId w:val="1005"/>
-        </w:numPr>
-      </w:pPr>
-      <w:r>
-        <w:t xml:space="preserve">Lower interoperability</w:t>
-      </w:r>
-    </w:p>
-    <w:p>
-      <w:pPr>
-        <w:pStyle w:val="Compact"/>
-        <w:numPr>
-          <w:ilvl w:val="0"/>
-          <w:numId w:val="1005"/>
-        </w:numPr>
-      </w:pPr>
-      <w:r>
-        <w:t xml:space="preserve">Reduced confidence in AI systems</w:t>
-      </w:r>
-    </w:p>
-    <w:p>
-      <w:pPr>
-        <w:pStyle w:val="FirstParagraph"/>
-      </w:pPr>
-      <w:r>
-        <w:t xml:space="preserve">OncoReconcile AI focuses on improving data quality before downstream analytics and AI workflows.</w:t>
-      </w:r>
-    </w:p>
-    <w:p>
-      <w:r>
-        <w:pict>
-          <ns1:rect style="width:0;height:1.5pt" ns2:hralign="center" ns2:hrstd="t" ns2:hr="t"/>
-        </w:pict>
-      </w:r>
-    </w:p>
-    <w:bookmarkEnd w:id="17"/>
-    <w:bookmarkStart w:id="21" w:name="solution-overview"/>
-    <w:p>
-      <w:pPr>
-        <w:pStyle w:val="Heading2"/>
-      </w:pPr>
-      <w:r>
-        <w:t xml:space="preserve">Solution Overview</w:t>
-      </w:r>
-    </w:p>
-    <w:p>
-      <w:pPr>
-        <w:pStyle w:val="SourceCode"/>
-      </w:pPr>
-      <w:r>
-        <w:rPr>
-          <w:rStyle w:val="VerbatimChar"/>
-        </w:rPr>
-        <w:t xml:space="preserve">Disease / Gene / Variant Input</w:t>
-      </w:r>
-      <w:r>
-        <w:br/>
-      </w:r>
-      <w:r>
-        <w:rPr>
-          <w:rStyle w:val="VerbatimChar"/>
-        </w:rPr>
-        <w:t xml:space="preserve">                |</w:t>
-      </w:r>
-      <w:r>
-        <w:br/>
-      </w:r>
-      <w:r>
-        <w:rPr>
-          <w:rStyle w:val="VerbatimChar"/>
-        </w:rPr>
-        <w:t xml:space="preserve">                v</w:t>
-      </w:r>
-      <w:r>
-        <w:br/>
-      </w:r>
-      <w:r>
-        <w:rPr>
-          <w:rStyle w:val="VerbatimChar"/>
-        </w:rPr>
-        <w:t xml:space="preserve">       Entity Resolution</w:t>
-      </w:r>
-      <w:r>
-        <w:br/>
-      </w:r>
-      <w:r>
-        <w:rPr>
-          <w:rStyle w:val="VerbatimChar"/>
-        </w:rPr>
-        <w:t xml:space="preserve">                |</w:t>
-      </w:r>
-      <w:r>
-        <w:br/>
-      </w:r>
-      <w:r>
-        <w:rPr>
-          <w:rStyle w:val="VerbatimChar"/>
-        </w:rPr>
-        <w:t xml:space="preserve">                v</w:t>
-      </w:r>
-      <w:r>
-        <w:br/>
-      </w:r>
-      <w:r>
-        <w:rPr>
-          <w:rStyle w:val="VerbatimChar"/>
-        </w:rPr>
-        <w:t xml:space="preserve">       Evidence Retrieval</w:t>
-      </w:r>
-      <w:r>
-        <w:br/>
-      </w:r>
-      <w:r>
-        <w:rPr>
-          <w:rStyle w:val="VerbatimChar"/>
-        </w:rPr>
-        <w:t xml:space="preserve">                |</w:t>
-      </w:r>
-      <w:r>
-        <w:br/>
-      </w:r>
-      <w:r>
-        <w:rPr>
-          <w:rStyle w:val="VerbatimChar"/>
-        </w:rPr>
-        <w:t xml:space="preserve">                v</w:t>
-      </w:r>
-      <w:r>
-        <w:br/>
-      </w:r>
-      <w:r>
-        <w:rPr>
-          <w:rStyle w:val="VerbatimChar"/>
-        </w:rPr>
-        <w:t xml:space="preserve">       Confidence Scoring</w:t>
-      </w:r>
-      <w:r>
-        <w:br/>
-      </w:r>
-      <w:r>
-        <w:rPr>
-          <w:rStyle w:val="VerbatimChar"/>
-        </w:rPr>
-        <w:t xml:space="preserve">                |</w:t>
-      </w:r>
-      <w:r>
-        <w:br/>
-      </w:r>
-      <w:r>
-        <w:rPr>
-          <w:rStyle w:val="VerbatimChar"/>
-        </w:rPr>
-        <w:t xml:space="preserve">                v</w:t>
-      </w:r>
-      <w:r>
-        <w:br/>
-      </w:r>
-      <w:r>
-        <w:rPr>
-          <w:rStyle w:val="VerbatimChar"/>
-        </w:rPr>
-        <w:t xml:space="preserve">       Governance Decision</w:t>
-      </w:r>
-      <w:r>
-        <w:br/>
-      </w:r>
-      <w:r>
-        <w:rPr>
-          <w:rStyle w:val="VerbatimChar"/>
-        </w:rPr>
-        <w:t xml:space="preserve">        /       |        \</w:t>
-      </w:r>
-      <w:r>
-        <w:br/>
-      </w:r>
-      <w:r>
-        <w:rPr>
-          <w:rStyle w:val="VerbatimChar"/>
-        </w:rPr>
-        <w:t xml:space="preserve">AUTO_RECONCILE REVIEW_REQUIRED CANNOT_RECONCILE</w:t>
-      </w:r>
-      <w:r>
-        <w:br/>
-      </w:r>
-      <w:r>
-        <w:rPr>
-          <w:rStyle w:val="VerbatimChar"/>
-        </w:rPr>
-        <w:t xml:space="preserve">                |</w:t>
-      </w:r>
-      <w:r>
-        <w:br/>
-      </w:r>
-      <w:r>
-        <w:rPr>
-          <w:rStyle w:val="VerbatimChar"/>
-        </w:rPr>
-        <w:t xml:space="preserve">                v</w:t>
-      </w:r>
-      <w:r>
-        <w:br/>
-      </w:r>
-      <w:r>
-        <w:rPr>
-          <w:rStyle w:val="VerbatimChar"/>
-        </w:rPr>
-        <w:t xml:space="preserve">         Human Review</w:t>
-      </w:r>
-      <w:r>
-        <w:br/>
-      </w:r>
-      <w:r>
-        <w:rPr>
-          <w:rStyle w:val="VerbatimChar"/>
-        </w:rPr>
-        <w:t xml:space="preserve">                |</w:t>
-      </w:r>
-      <w:r>
-        <w:br/>
-      </w:r>
-      <w:r>
-        <w:rPr>
-          <w:rStyle w:val="VerbatimChar"/>
-        </w:rPr>
-        <w:t xml:space="preserve">                v</w:t>
-      </w:r>
-      <w:r>
-        <w:br/>
-      </w:r>
-      <w:r>
-        <w:rPr>
-          <w:rStyle w:val="VerbatimChar"/>
-        </w:rPr>
-        <w:t xml:space="preserve">          Curated Output</w:t>
-      </w:r>
-      <w:r>
-        <w:br/>
-      </w:r>
-      <w:r>
-        <w:rPr>
-          <w:rStyle w:val="VerbatimChar"/>
-        </w:rPr>
-        <w:t xml:space="preserve">                |</w:t>
-      </w:r>
-      <w:r>
-        <w:br/>
-      </w:r>
-      <w:r>
-        <w:rPr>
-          <w:rStyle w:val="VerbatimChar"/>
-        </w:rPr>
-        <w:t xml:space="preserve">                v</w:t>
-      </w:r>
-      <w:r>
-        <w:br/>
-      </w:r>
-      <w:r>
-        <w:rPr>
-          <w:rStyle w:val="VerbatimChar"/>
-        </w:rPr>
-        <w:t xml:space="preserve">     FHIR / OMOP / Analytics</w:t>
-      </w:r>
-    </w:p>
-    <w:p>
-      <w:pPr>
-        <w:pStyle w:val="FirstParagraph"/>
-        <w:jc w:val="center"/>
-      </w:pPr>
-      <w:r>
-        <w:drawing>
-          <wp:inline>
-            <wp:extent cx="5303520" cy="3683000"/>
-            <wp:effectExtent b="0" l="0" r="0" t="0"/>
-            <wp:docPr descr="" title="" id="19" name="Picture"/>
-            <a:graphic>
-              <a:graphicData uri="http://schemas.openxmlformats.org/drawingml/2006/picture">
-                <pic:pic>
-                  <pic:nvPicPr>
-                    <pic:cNvPr descr="screenshots/02-single-record-reconciliation.png" id="20" name="Picture"/>
-                    <pic:cNvPicPr>
-                      <a:picLocks noChangeArrowheads="1" noChangeAspect="1"/>
-                    </pic:cNvPicPr>
-                  </pic:nvPicPr>
-                  <pic:blipFill>
-                    <a:blip r:embed="rId18"/>
-                    <a:stretch>
-                      <a:fillRect/>
-                    </a:stretch>
-                  </pic:blipFill>
-                  <pic:spPr bwMode="auto">
-                    <a:xfrm>
-                      <a:off x="0" y="0"/>
-                      <a:ext cx="5303520" cy="3683000"/>
-                    </a:xfrm>
-                    <a:prstGeom prst="rect">
-                      <a:avLst/>
-                    </a:prstGeom>
-                    <a:noFill/>
-                    <a:ln w="9525">
-                      <a:noFill/>
-                      <a:headEnd/>
-                      <a:tailEnd/>
-                    </a:ln>
-                  </pic:spPr>
-                </pic:pic>
-              </a:graphicData>
-            </a:graphic>
-          </wp:inline>
-        </w:drawing>
-      </w:r>
-    </w:p>
-    <w:p>
-      <w:pPr>
-        <w:pStyle w:val="BodyText"/>
-      </w:pPr>
-      <w:r>
-        <w:rPr>
-          <w:b/>
-          <w:bCs/>
-        </w:rPr>
-        <w:t xml:space="preserve">Figure 1. Single Record Reconciliation</w:t>
-      </w:r>
-    </w:p>
-    <w:p>
-      <w:r>
-        <w:pict>
-          <ns1:rect style="width:0;height:1.5pt" ns2:hralign="center" ns2:hrstd="t" ns2:hr="t"/>
-        </w:pict>
-      </w:r>
-    </w:p>
-    <w:bookmarkEnd w:id="21"/>
-    <w:bookmarkStart w:id="28" w:name="core-platform-capabilities"/>
-    <w:p>
-      <w:pPr>
-        <w:pStyle w:val="Heading2"/>
-      </w:pPr>
-      <w:r>
-        <w:t xml:space="preserve">Core Platform Capabilities</w:t>
-      </w:r>
-    </w:p>
-    <w:bookmarkStart w:id="22" w:name="reconciliation-engine"/>
-    <w:p>
-      <w:pPr>
-        <w:pStyle w:val="Heading3"/>
-      </w:pPr>
-      <w:r>
-        <w:t xml:space="preserve">Reconciliation Engine</w:t>
-      </w:r>
-    </w:p>
-    <w:p>
-      <w:pPr>
-        <w:pStyle w:val="Compact"/>
-        <w:numPr>
-          <w:ilvl w:val="0"/>
-          <w:numId w:val="1006"/>
-        </w:numPr>
-      </w:pPr>
-      <w:r>
-        <w:t xml:space="preserve">Disease reconciliation</w:t>
-      </w:r>
-    </w:p>
-    <w:p>
-      <w:pPr>
-        <w:pStyle w:val="Compact"/>
-        <w:numPr>
-          <w:ilvl w:val="0"/>
-          <w:numId w:val="1006"/>
-        </w:numPr>
-      </w:pPr>
-      <w:r>
-        <w:t xml:space="preserve">Gene reconciliation</w:t>
-      </w:r>
-    </w:p>
-    <w:p>
-      <w:pPr>
-        <w:pStyle w:val="Compact"/>
-        <w:numPr>
-          <w:ilvl w:val="0"/>
-          <w:numId w:val="1006"/>
-        </w:numPr>
-      </w:pPr>
-      <w:r>
-        <w:t xml:space="preserve">Variant reconciliation</w:t>
-      </w:r>
-    </w:p>
-    <w:p>
-      <w:pPr>
-        <w:pStyle w:val="Compact"/>
-        <w:numPr>
-          <w:ilvl w:val="0"/>
-          <w:numId w:val="1006"/>
-        </w:numPr>
-      </w:pPr>
-      <w:r>
-        <w:t xml:space="preserve">Alias normalization</w:t>
-      </w:r>
-    </w:p>
-    <w:p>
-      <w:pPr>
-        <w:pStyle w:val="Compact"/>
-        <w:numPr>
-          <w:ilvl w:val="0"/>
-          <w:numId w:val="1006"/>
-        </w:numPr>
-      </w:pPr>
-      <w:r>
-        <w:t xml:space="preserve">Fuzzy matching</w:t>
-      </w:r>
-    </w:p>
-    <w:p>
-      <w:pPr>
-        <w:pStyle w:val="Compact"/>
-        <w:numPr>
-          <w:ilvl w:val="0"/>
-          <w:numId w:val="1006"/>
-        </w:numPr>
-      </w:pPr>
-      <w:r>
-        <w:t xml:space="preserve">Compound disease-gene-variant reasoning</w:t>
-      </w:r>
-    </w:p>
-    <w:bookmarkEnd w:id="22"/>
-    <w:bookmarkStart w:id="23" w:name="evidence-intelligence"/>
-    <w:p>
-      <w:pPr>
-        <w:pStyle w:val="Heading3"/>
-      </w:pPr>
-      <w:r>
-        <w:t xml:space="preserve">Evidence Intelligence</w:t>
-      </w:r>
-    </w:p>
-    <w:p>
-      <w:pPr>
-        <w:pStyle w:val="Compact"/>
-        <w:numPr>
-          <w:ilvl w:val="0"/>
-          <w:numId w:val="1007"/>
-        </w:numPr>
-      </w:pPr>
-      <w:r>
-        <w:t xml:space="preserve">Local oncology catalogs</w:t>
-      </w:r>
-    </w:p>
-    <w:p>
-      <w:pPr>
-        <w:pStyle w:val="Compact"/>
-        <w:numPr>
-          <w:ilvl w:val="0"/>
-          <w:numId w:val="1007"/>
-        </w:numPr>
-      </w:pPr>
-      <w:r>
-        <w:t xml:space="preserve">MyVariant.info integration</w:t>
-      </w:r>
-    </w:p>
-    <w:p>
-      <w:pPr>
-        <w:pStyle w:val="Compact"/>
-        <w:numPr>
-          <w:ilvl w:val="0"/>
-          <w:numId w:val="1007"/>
-        </w:numPr>
-      </w:pPr>
-      <w:r>
-        <w:t xml:space="preserve">ClinVar integration</w:t>
-      </w:r>
-    </w:p>
-    <w:p>
-      <w:pPr>
-        <w:pStyle w:val="Compact"/>
-        <w:numPr>
-          <w:ilvl w:val="0"/>
-          <w:numId w:val="1007"/>
-        </w:numPr>
-      </w:pPr>
-      <w:r>
-        <w:t xml:space="preserve">CIViC integration</w:t>
-      </w:r>
-    </w:p>
-    <w:p>
-      <w:pPr>
-        <w:pStyle w:val="Compact"/>
-        <w:numPr>
-          <w:ilvl w:val="0"/>
-          <w:numId w:val="1007"/>
-        </w:numPr>
-      </w:pPr>
-      <w:r>
-        <w:t xml:space="preserve">ClinGen reference support</w:t>
-      </w:r>
-    </w:p>
-    <w:bookmarkEnd w:id="23"/>
-    <w:bookmarkStart w:id="24" w:name="explainable-ai"/>
-    <w:p>
-      <w:pPr>
-        <w:pStyle w:val="Heading3"/>
-      </w:pPr>
-      <w:r>
-        <w:t xml:space="preserve">Explainable AI</w:t>
-      </w:r>
-    </w:p>
-    <w:p>
-      <w:pPr>
-        <w:pStyle w:val="Compact"/>
-        <w:numPr>
-          <w:ilvl w:val="0"/>
-          <w:numId w:val="1008"/>
-        </w:numPr>
-      </w:pPr>
-      <w:r>
-        <w:t xml:space="preserve">Confidence scores</w:t>
-      </w:r>
-    </w:p>
-    <w:p>
-      <w:pPr>
-        <w:pStyle w:val="Compact"/>
-        <w:numPr>
-          <w:ilvl w:val="0"/>
-          <w:numId w:val="1008"/>
-        </w:numPr>
-      </w:pPr>
-      <w:r>
-        <w:t xml:space="preserve">Audit trails</w:t>
-      </w:r>
-    </w:p>
-    <w:p>
-      <w:pPr>
-        <w:pStyle w:val="Compact"/>
-        <w:numPr>
-          <w:ilvl w:val="0"/>
-          <w:numId w:val="1008"/>
-        </w:numPr>
-      </w:pPr>
-      <w:r>
-        <w:t xml:space="preserve">Evidence packages</w:t>
-      </w:r>
-    </w:p>
-    <w:p>
-      <w:pPr>
-        <w:pStyle w:val="Compact"/>
-        <w:numPr>
-          <w:ilvl w:val="0"/>
-          <w:numId w:val="1008"/>
-        </w:numPr>
-      </w:pPr>
-      <w:r>
-        <w:t xml:space="preserve">Alternative candidate suggestions</w:t>
-      </w:r>
-    </w:p>
-    <w:p>
-      <w:pPr>
-        <w:pStyle w:val="Compact"/>
-        <w:numPr>
-          <w:ilvl w:val="0"/>
-          <w:numId w:val="1008"/>
-        </w:numPr>
-      </w:pPr>
-      <w:r>
-        <w:t xml:space="preserve">Provenance tracking</w:t>
-      </w:r>
-    </w:p>
-    <w:bookmarkEnd w:id="24"/>
-    <w:bookmarkStart w:id="25" w:name="human-governance"/>
-    <w:p>
-      <w:pPr>
-        <w:pStyle w:val="Heading3"/>
-      </w:pPr>
-      <w:r>
-        <w:t xml:space="preserve">Human Governance</w:t>
-      </w:r>
-    </w:p>
-    <w:p>
-      <w:pPr>
-        <w:pStyle w:val="Compact"/>
-        <w:numPr>
-          <w:ilvl w:val="0"/>
-          <w:numId w:val="1009"/>
-        </w:numPr>
-      </w:pPr>
-      <w:r>
-        <w:t xml:space="preserve">Review queue</w:t>
-      </w:r>
-    </w:p>
-    <w:p>
-      <w:pPr>
-        <w:pStyle w:val="Compact"/>
-        <w:numPr>
-          <w:ilvl w:val="0"/>
-          <w:numId w:val="1009"/>
-        </w:numPr>
-      </w:pPr>
-      <w:r>
-        <w:t xml:space="preserve">Reviewer decisions</w:t>
-      </w:r>
-    </w:p>
-    <w:p>
-      <w:pPr>
-        <w:pStyle w:val="Compact"/>
-        <w:numPr>
-          <w:ilvl w:val="0"/>
-          <w:numId w:val="1009"/>
-        </w:numPr>
-      </w:pPr>
-      <w:r>
-        <w:t xml:space="preserve">Adjudication workflow</w:t>
-      </w:r>
-    </w:p>
-    <w:p>
-      <w:pPr>
-        <w:pStyle w:val="Compact"/>
-        <w:numPr>
-          <w:ilvl w:val="0"/>
-          <w:numId w:val="1009"/>
-        </w:numPr>
-      </w:pPr>
-      <w:r>
-        <w:t xml:space="preserve">Review reopening</w:t>
-      </w:r>
-    </w:p>
-    <w:p>
-      <w:pPr>
-        <w:pStyle w:val="Compact"/>
-        <w:numPr>
-          <w:ilvl w:val="0"/>
-          <w:numId w:val="1009"/>
-        </w:numPr>
-      </w:pPr>
-      <w:r>
-        <w:t xml:space="preserve">Governance metrics</w:t>
-      </w:r>
-    </w:p>
-    <w:bookmarkEnd w:id="25"/>
-    <w:bookmarkStart w:id="26" w:name="interoperability"/>
-    <w:p>
-      <w:pPr>
-        <w:pStyle w:val="Heading3"/>
-      </w:pPr>
-      <w:r>
-        <w:t xml:space="preserve">Interoperability</w:t>
-      </w:r>
-    </w:p>
-    <w:p>
-      <w:pPr>
-        <w:pStyle w:val="Compact"/>
-        <w:numPr>
-          <w:ilvl w:val="0"/>
-          <w:numId w:val="1010"/>
-        </w:numPr>
-      </w:pPr>
-      <w:r>
-        <w:t xml:space="preserve">FHIR export</w:t>
-      </w:r>
-    </w:p>
-    <w:p>
-      <w:pPr>
-        <w:pStyle w:val="Compact"/>
-        <w:numPr>
-          <w:ilvl w:val="0"/>
-          <w:numId w:val="1010"/>
-        </w:numPr>
-      </w:pPr>
-      <w:r>
-        <w:t xml:space="preserve">OMOP export</w:t>
-      </w:r>
-    </w:p>
-    <w:p>
-      <w:pPr>
-        <w:pStyle w:val="Compact"/>
-        <w:numPr>
-          <w:ilvl w:val="0"/>
-          <w:numId w:val="1010"/>
-        </w:numPr>
-      </w:pPr>
-      <w:r>
-        <w:t xml:space="preserve">Knowledge graph export</w:t>
-      </w:r>
-    </w:p>
-    <w:p>
-      <w:pPr>
-        <w:pStyle w:val="Compact"/>
-        <w:numPr>
-          <w:ilvl w:val="0"/>
-          <w:numId w:val="1010"/>
-        </w:numPr>
-      </w:pPr>
-      <w:r>
-        <w:t xml:space="preserve">VRS-inspired structures</w:t>
-      </w:r>
-    </w:p>
-    <w:p>
-      <w:pPr>
-        <w:pStyle w:val="Compact"/>
-        <w:numPr>
-          <w:ilvl w:val="0"/>
-          <w:numId w:val="1010"/>
-        </w:numPr>
-      </w:pPr>
-      <w:r>
-        <w:t xml:space="preserve">Cat-VRS-inspired structures</w:t>
-      </w:r>
-    </w:p>
-    <w:p>
-      <w:pPr>
-        <w:pStyle w:val="Compact"/>
-        <w:numPr>
-          <w:ilvl w:val="0"/>
-          <w:numId w:val="1010"/>
-        </w:numPr>
-      </w:pPr>
-      <w:r>
-        <w:t xml:space="preserve">VA-Spec-inspired provenance</w:t>
-      </w:r>
-    </w:p>
-    <w:bookmarkEnd w:id="26"/>
-    <w:bookmarkStart w:id="27" w:name="analytics"/>
-    <w:p>
-      <w:pPr>
-        <w:pStyle w:val="Heading3"/>
-      </w:pPr>
-      <w:r>
-        <w:t xml:space="preserve">Analytics</w:t>
-      </w:r>
-    </w:p>
-    <w:p>
-      <w:pPr>
-        <w:pStyle w:val="Compact"/>
-        <w:numPr>
-          <w:ilvl w:val="0"/>
-          <w:numId w:val="1011"/>
-        </w:numPr>
-      </w:pPr>
-      <w:r>
-        <w:t xml:space="preserve">Evaluation dashboard</w:t>
-      </w:r>
-    </w:p>
-    <w:p>
-      <w:pPr>
-        <w:pStyle w:val="Compact"/>
-        <w:numPr>
-          <w:ilvl w:val="0"/>
-          <w:numId w:val="1011"/>
-        </w:numPr>
-      </w:pPr>
-      <w:r>
-        <w:t xml:space="preserve">Benchmark reporting</w:t>
-      </w:r>
-    </w:p>
-    <w:p>
-      <w:pPr>
-        <w:pStyle w:val="Compact"/>
-        <w:numPr>
-          <w:ilvl w:val="0"/>
-          <w:numId w:val="1011"/>
-        </w:numPr>
-      </w:pPr>
-      <w:r>
-        <w:t xml:space="preserve">Safety reporting</w:t>
-      </w:r>
-    </w:p>
-    <w:p>
-      <w:pPr>
-        <w:pStyle w:val="Compact"/>
-        <w:numPr>
-          <w:ilvl w:val="0"/>
-          <w:numId w:val="1011"/>
-        </w:numPr>
-      </w:pPr>
-      <w:r>
-        <w:t xml:space="preserve">Review metrics</w:t>
-      </w:r>
-    </w:p>
-    <w:p>
-      <w:pPr>
-        <w:pStyle w:val="Compact"/>
-        <w:numPr>
-          <w:ilvl w:val="0"/>
-          <w:numId w:val="1011"/>
-        </w:numPr>
-      </w:pPr>
-      <w:r>
-        <w:t xml:space="preserve">Data quality metrics</w:t>
-      </w:r>
-    </w:p>
-    <w:p>
-      <w:r>
-        <w:pict>
-          <ns1:rect style="width:0;height:1.5pt" ns2:hralign="center" ns2:hrstd="t" ns2:hr="t"/>
-        </w:pict>
-      </w:r>
-    </w:p>
-    <w:bookmarkEnd w:id="27"/>
-    <w:bookmarkEnd w:id="28"/>
-    <w:bookmarkStart w:id="29" w:name="gui-demonstration-workflow"/>
-    <w:p>
-      <w:pPr>
-        <w:pStyle w:val="Heading2"/>
-      </w:pPr>
-      <w:r>
-        <w:t xml:space="preserve">GUI Demonstration Workflow</w:t>
-      </w:r>
-    </w:p>
-    <w:p>
-      <w:pPr>
-        <w:pStyle w:val="FirstParagraph"/>
-      </w:pPr>
-      <w:r>
-        <w:t xml:space="preserve">The current frontend is organized into five judge-facing tabs:</w:t>
-      </w:r>
-    </w:p>
-    <w:tbl>
-      <w:tblPr>
-        <w:tblStyle w:val="Table"/>
-        <w:tblW w:type="pct" w:w="5000"/>
-        <w:tblLayout w:type="fixed"/>
-        <w:tblLook w:firstRow="1" w:lastRow="0" w:firstColumn="0" w:lastColumn="0" w:noHBand="0" w:noVBand="0" w:val="0020"/>
-      </w:tblPr>
-      <w:tblGrid>
-        <w:gridCol w:w="3960"/>
-        <w:gridCol w:w="3960"/>
-      </w:tblGrid>
-      <w:tr>
-        <w:trPr>
-          <w:tblHeader w:val="on"/>
-        </w:trPr>
-        <w:tc>
-          <w:tcPr/>
-          <w:p>
-            <w:pPr>
-              <w:pStyle w:val="Compact"/>
-            </w:pPr>
-            <w:r>
-              <w:t xml:space="preserve">GUI Tab</w:t>
-            </w:r>
-          </w:p>
-        </w:tc>
-        <w:tc>
-          <w:tcPr/>
-          <w:p>
-            <w:pPr>
-              <w:pStyle w:val="Compact"/>
-            </w:pPr>
-            <w:r>
-              <w:t xml:space="preserve">What Judges Can See</w:t>
-            </w:r>
-          </w:p>
-        </w:tc>
-      </w:tr>
-      <w:tr>
-        <w:tc>
-          <w:tcPr/>
-          <w:p>
-            <w:pPr>
-              <w:pStyle w:val="Compact"/>
-            </w:pPr>
-            <w:r>
-              <w:t xml:space="preserve">Single Record</w:t>
-            </w:r>
-          </w:p>
-        </w:tc>
-        <w:tc>
-          <w:tcPr/>
-          <w:p>
-            <w:pPr>
-              <w:pStyle w:val="Compact"/>
-            </w:pPr>
-            <w:r>
-              <w:t xml:space="preserve">Manual disease/gene/variant input, featured demo case, guided examples, canonical output, confidence score, evidence badges, decision rationale, alternatives, audit trail, and standards/export actions.</w:t>
-            </w:r>
-          </w:p>
-        </w:tc>
-      </w:tr>
-      <w:tr>
-        <w:tc>
-          <w:tcPr/>
-          <w:p>
-            <w:pPr>
-              <w:pStyle w:val="Compact"/>
-            </w:pPr>
-            <w:r>
-              <w:t xml:space="preserve">CSV Upload</w:t>
-            </w:r>
-          </w:p>
-        </w:tc>
-        <w:tc>
-          <w:tcPr/>
-          <w:p>
-            <w:pPr>
-              <w:pStyle w:val="Compact"/>
-            </w:pPr>
-            <w:r>
-              <w:t xml:space="preserve">Sample CSV, downloadable demo CSV, upload-and-reconcile workflow, batch status summary, and expandable result cards for each row.</w:t>
-            </w:r>
-          </w:p>
-        </w:tc>
-      </w:tr>
-      <w:tr>
-        <w:tc>
-          <w:tcPr/>
-          <w:p>
-            <w:pPr>
-              <w:pStyle w:val="Compact"/>
-            </w:pPr>
-            <w:r>
-              <w:t xml:space="preserve">Review Queue</w:t>
-            </w:r>
-          </w:p>
-        </w:tc>
-        <w:tc>
-          <w:tcPr/>
-          <w:p>
-            <w:pPr>
-              <w:pStyle w:val="Compact"/>
-            </w:pPr>
-            <w:r>
-              <w:t xml:space="preserve">Seeded review examples, pending/reviewed filters, curator ID, evidence/candidate indicators, approve/reject/edit/reopen actions, review history, and adjudication support.</w:t>
-            </w:r>
-          </w:p>
-        </w:tc>
-      </w:tr>
-      <w:tr>
-        <w:tc>
-          <w:tcPr/>
-          <w:p>
-            <w:pPr>
-              <w:pStyle w:val="Compact"/>
-            </w:pPr>
-            <w:r>
-              <w:t xml:space="preserve">Benchmark</w:t>
-            </w:r>
-          </w:p>
-        </w:tc>
-        <w:tc>
-          <w:tcPr/>
-          <w:p>
-            <w:pPr>
-              <w:pStyle w:val="Compact"/>
-            </w:pPr>
-            <w:r>
-              <w:t xml:space="preserve">Accuracy, coverage, review rate, total cases, status counts, evidence counts, review-decision counts, and benchmark-source explanation.</w:t>
-            </w:r>
-          </w:p>
-        </w:tc>
-      </w:tr>
-      <w:tr>
-        <w:tc>
-          <w:tcPr/>
-          <w:p>
-            <w:pPr>
-              <w:pStyle w:val="Compact"/>
-            </w:pPr>
-            <w:r>
-              <w:t xml:space="preserve">Evaluation</w:t>
-            </w:r>
-          </w:p>
-        </w:tc>
-        <w:tc>
-          <w:tcPr/>
-          <w:p>
-            <w:pPr>
-              <w:pStyle w:val="Compact"/>
-            </w:pPr>
-            <w:r>
-              <w:t xml:space="preserve">Visual KPI cards, status distribution, accuracy/coverage chart, review-rate chart, false auto-accept rate, evidence-source chart, reviewer agreement, review-decision chart, and failure breakdown.</w:t>
-            </w:r>
-          </w:p>
-        </w:tc>
-      </w:tr>
-    </w:tbl>
-    <w:p>
-      <w:pPr>
-        <w:pStyle w:val="BodyText"/>
-      </w:pPr>
-      <w:r>
-        <w:t xml:space="preserve">This workflow directly supports the presentation score because the demo can move from a messy oncology input to a governed, explainable, benchmarked output without requiring judges to inspect code.</w:t>
-      </w:r>
-    </w:p>
-    <w:p>
-      <w:r>
-        <w:pict>
-          <ns1:rect style="width:0;height:1.5pt" ns2:hralign="center" ns2:hrstd="t" ns2:hr="t"/>
-        </w:pict>
-      </w:r>
-    </w:p>
-    <w:bookmarkEnd w:id="29"/>
-    <w:bookmarkStart w:id="30" w:name="technical-architecture"/>
-    <w:p>
-      <w:pPr>
-        <w:pStyle w:val="Heading2"/>
-      </w:pPr>
-      <w:r>
-        <w:t xml:space="preserve">Technical Architecture</w:t>
-      </w:r>
-    </w:p>
-    <w:p>
-      <w:pPr>
-        <w:pStyle w:val="SourceCode"/>
-      </w:pPr>
-      <w:r>
-        <w:rPr>
-          <w:rStyle w:val="VerbatimChar"/>
-        </w:rPr>
-        <w:t xml:space="preserve">Clinical Data Sources</w:t>
-      </w:r>
-      <w:r>
-        <w:br/>
-      </w:r>
-      <w:r>
-        <w:rPr>
-          <w:rStyle w:val="VerbatimChar"/>
-        </w:rPr>
-        <w:t xml:space="preserve">Genomic Data Sources</w:t>
-      </w:r>
-      <w:r>
-        <w:br/>
-      </w:r>
-      <w:r>
-        <w:rPr>
-          <w:rStyle w:val="VerbatimChar"/>
-        </w:rPr>
-        <w:t xml:space="preserve">Laboratory Data Sources</w:t>
-      </w:r>
-      <w:r>
-        <w:br/>
-      </w:r>
-      <w:r>
-        <w:br/>
-      </w:r>
-      <w:r>
-        <w:rPr>
-          <w:rStyle w:val="VerbatimChar"/>
-        </w:rPr>
-        <w:t xml:space="preserve">            |</w:t>
-      </w:r>
-      <w:r>
-        <w:br/>
-      </w:r>
-      <w:r>
-        <w:rPr>
-          <w:rStyle w:val="VerbatimChar"/>
-        </w:rPr>
-        <w:t xml:space="preserve">            v</w:t>
-      </w:r>
-      <w:r>
-        <w:br/>
-      </w:r>
-      <w:r>
-        <w:br/>
-      </w:r>
-      <w:r>
-        <w:rPr>
-          <w:rStyle w:val="VerbatimChar"/>
-        </w:rPr>
-        <w:t xml:space="preserve">    Normalization Layer</w:t>
-      </w:r>
-      <w:r>
-        <w:br/>
-      </w:r>
-      <w:r>
-        <w:br/>
-      </w:r>
-      <w:r>
-        <w:rPr>
-          <w:rStyle w:val="VerbatimChar"/>
-        </w:rPr>
-        <w:t xml:space="preserve">            |</w:t>
-      </w:r>
-      <w:r>
-        <w:br/>
-      </w:r>
-      <w:r>
-        <w:rPr>
-          <w:rStyle w:val="VerbatimChar"/>
-        </w:rPr>
-        <w:t xml:space="preserve">            v</w:t>
-      </w:r>
-      <w:r>
-        <w:br/>
-      </w:r>
-      <w:r>
-        <w:br/>
-      </w:r>
-      <w:r>
-        <w:rPr>
-          <w:rStyle w:val="VerbatimChar"/>
-        </w:rPr>
-        <w:t xml:space="preserve">   Entity Resolution Layer</w:t>
-      </w:r>
-      <w:r>
-        <w:br/>
-      </w:r>
-      <w:r>
-        <w:br/>
-      </w:r>
-      <w:r>
-        <w:rPr>
-          <w:rStyle w:val="VerbatimChar"/>
-        </w:rPr>
-        <w:t xml:space="preserve">            |</w:t>
-      </w:r>
-      <w:r>
-        <w:br/>
-      </w:r>
-      <w:r>
-        <w:rPr>
-          <w:rStyle w:val="VerbatimChar"/>
-        </w:rPr>
-        <w:t xml:space="preserve">            v</w:t>
-      </w:r>
-      <w:r>
-        <w:br/>
-      </w:r>
-      <w:r>
-        <w:br/>
-      </w:r>
-      <w:r>
-        <w:rPr>
-          <w:rStyle w:val="VerbatimChar"/>
-        </w:rPr>
-        <w:t xml:space="preserve">    Evidence Retrieval</w:t>
-      </w:r>
-      <w:r>
-        <w:br/>
-      </w:r>
-      <w:r>
-        <w:br/>
-      </w:r>
-      <w:r>
-        <w:rPr>
-          <w:rStyle w:val="VerbatimChar"/>
-        </w:rPr>
-        <w:t xml:space="preserve">            |</w:t>
-      </w:r>
-      <w:r>
-        <w:br/>
-      </w:r>
-      <w:r>
-        <w:rPr>
-          <w:rStyle w:val="VerbatimChar"/>
-        </w:rPr>
-        <w:t xml:space="preserve">            v</w:t>
-      </w:r>
-      <w:r>
-        <w:br/>
-      </w:r>
-      <w:r>
-        <w:br/>
-      </w:r>
-      <w:r>
-        <w:rPr>
-          <w:rStyle w:val="VerbatimChar"/>
-        </w:rPr>
-        <w:t xml:space="preserve">     Confidence Engine</w:t>
-      </w:r>
-      <w:r>
-        <w:br/>
-      </w:r>
-      <w:r>
-        <w:br/>
-      </w:r>
-      <w:r>
-        <w:rPr>
-          <w:rStyle w:val="VerbatimChar"/>
-        </w:rPr>
-        <w:t xml:space="preserve">            |</w:t>
-      </w:r>
-      <w:r>
-        <w:br/>
-      </w:r>
-      <w:r>
-        <w:rPr>
-          <w:rStyle w:val="VerbatimChar"/>
-        </w:rPr>
-        <w:t xml:space="preserve">            v</w:t>
-      </w:r>
-      <w:r>
-        <w:br/>
-      </w:r>
-      <w:r>
-        <w:br/>
-      </w:r>
-      <w:r>
-        <w:rPr>
-          <w:rStyle w:val="VerbatimChar"/>
-        </w:rPr>
-        <w:t xml:space="preserve">     Governance Engine</w:t>
-      </w:r>
-      <w:r>
-        <w:br/>
-      </w:r>
-      <w:r>
-        <w:br/>
-      </w:r>
-      <w:r>
-        <w:rPr>
-          <w:rStyle w:val="VerbatimChar"/>
-        </w:rPr>
-        <w:t xml:space="preserve">            |</w:t>
-      </w:r>
-      <w:r>
-        <w:br/>
-      </w:r>
-      <w:r>
-        <w:rPr>
-          <w:rStyle w:val="VerbatimChar"/>
-        </w:rPr>
-        <w:t xml:space="preserve">            v</w:t>
-      </w:r>
-      <w:r>
-        <w:br/>
-      </w:r>
-      <w:r>
-        <w:br/>
-      </w:r>
-      <w:r>
-        <w:rPr>
-          <w:rStyle w:val="VerbatimChar"/>
-        </w:rPr>
-        <w:t xml:space="preserve">      Human Review</w:t>
-      </w:r>
-      <w:r>
-        <w:br/>
-      </w:r>
-      <w:r>
-        <w:br/>
-      </w:r>
-      <w:r>
-        <w:rPr>
-          <w:rStyle w:val="VerbatimChar"/>
-        </w:rPr>
-        <w:t xml:space="preserve">            |</w:t>
-      </w:r>
-      <w:r>
-        <w:br/>
-      </w:r>
-      <w:r>
-        <w:rPr>
-          <w:rStyle w:val="VerbatimChar"/>
-        </w:rPr>
-        <w:t xml:space="preserve">            v</w:t>
-      </w:r>
-      <w:r>
-        <w:br/>
-      </w:r>
-      <w:r>
-        <w:br/>
-      </w:r>
-      <w:r>
-        <w:rPr>
-          <w:rStyle w:val="VerbatimChar"/>
-        </w:rPr>
-        <w:t xml:space="preserve">    FHIR / OMOP Export</w:t>
-      </w:r>
-      <w:r>
-        <w:br/>
-      </w:r>
-      <w:r>
-        <w:br/>
-      </w:r>
-      <w:r>
-        <w:rPr>
-          <w:rStyle w:val="VerbatimChar"/>
-        </w:rPr>
-        <w:t xml:space="preserve">            |</w:t>
-      </w:r>
-      <w:r>
-        <w:br/>
-      </w:r>
-      <w:r>
-        <w:rPr>
-          <w:rStyle w:val="VerbatimChar"/>
-        </w:rPr>
-        <w:t xml:space="preserve">            v</w:t>
-      </w:r>
-      <w:r>
-        <w:br/>
-      </w:r>
-      <w:r>
-        <w:br/>
-      </w:r>
-      <w:r>
-        <w:rPr>
-          <w:rStyle w:val="VerbatimChar"/>
-        </w:rPr>
-        <w:t xml:space="preserve"> Analytics &amp; AI Applications</w:t>
-      </w:r>
-    </w:p>
-    <w:p>
-      <w:pPr>
-        <w:pStyle w:val="FirstParagraph"/>
-      </w:pPr>
-      <w:r>
-        <w:t xml:space="preserve">The architecture separates deterministic normalization, evidence discovery, confidence assessment, governance, and export. This separation supports traceability and allows enterprise teams to integrate the platform into existing oncology data pipelines without making automated clinical decisions.</w:t>
-      </w:r>
-    </w:p>
-    <w:p>
-      <w:r>
-        <w:pict>
-          <ns1:rect style="width:0;height:1.5pt" ns2:hralign="center" ns2:hrstd="t" ns2:hr="t"/>
-        </w:pict>
-      </w:r>
-    </w:p>
     <w:bookmarkEnd w:id="30"/>
     <w:bookmarkStart w:id="45" w:name="data-collection-curation-pipeline"/>
     <w:p>
@@ -2470,7 +2423,7 @@
         <w:pStyle w:val="Compact"/>
         <w:numPr>
           <w:ilvl w:val="0"/>
-          <w:numId w:val="1012"/>
+          <w:numId w:val="1013"/>
         </w:numPr>
       </w:pPr>
       <w:r>
@@ -2537,7 +2490,7 @@
         <w:pStyle w:val="Compact"/>
         <w:numPr>
           <w:ilvl w:val="0"/>
-          <w:numId w:val="1012"/>
+          <w:numId w:val="1013"/>
         </w:numPr>
       </w:pPr>
       <w:r>
@@ -2587,7 +2540,7 @@
         <w:pStyle w:val="Compact"/>
         <w:numPr>
           <w:ilvl w:val="0"/>
-          <w:numId w:val="1012"/>
+          <w:numId w:val="1013"/>
         </w:numPr>
       </w:pPr>
       <w:r>
@@ -2623,7 +2576,7 @@
         <w:pStyle w:val="Compact"/>
         <w:numPr>
           <w:ilvl w:val="0"/>
-          <w:numId w:val="1012"/>
+          <w:numId w:val="1013"/>
         </w:numPr>
       </w:pPr>
       <w:r>
@@ -2659,7 +2612,7 @@
         <w:pStyle w:val="Compact"/>
         <w:numPr>
           <w:ilvl w:val="0"/>
-          <w:numId w:val="1012"/>
+          <w:numId w:val="1013"/>
         </w:numPr>
       </w:pPr>
       <w:r>
@@ -2737,7 +2690,7 @@
         <w:pStyle w:val="Compact"/>
         <w:numPr>
           <w:ilvl w:val="0"/>
-          <w:numId w:val="1012"/>
+          <w:numId w:val="1013"/>
         </w:numPr>
       </w:pPr>
       <w:r>
@@ -3363,7 +3316,7 @@
         <w:pStyle w:val="Compact"/>
         <w:numPr>
           <w:ilvl w:val="0"/>
-          <w:numId w:val="1013"/>
+          <w:numId w:val="1014"/>
         </w:numPr>
       </w:pPr>
       <w:r>
@@ -3375,7 +3328,7 @@
         <w:pStyle w:val="Compact"/>
         <w:numPr>
           <w:ilvl w:val="0"/>
-          <w:numId w:val="1013"/>
+          <w:numId w:val="1014"/>
         </w:numPr>
       </w:pPr>
       <w:r>
@@ -3387,7 +3340,7 @@
         <w:pStyle w:val="Compact"/>
         <w:numPr>
           <w:ilvl w:val="0"/>
-          <w:numId w:val="1013"/>
+          <w:numId w:val="1014"/>
         </w:numPr>
       </w:pPr>
       <w:r>
@@ -3399,7 +3352,7 @@
         <w:pStyle w:val="Compact"/>
         <w:numPr>
           <w:ilvl w:val="0"/>
-          <w:numId w:val="1013"/>
+          <w:numId w:val="1014"/>
         </w:numPr>
       </w:pPr>
       <w:r>
@@ -3411,7 +3364,7 @@
         <w:pStyle w:val="Compact"/>
         <w:numPr>
           <w:ilvl w:val="0"/>
-          <w:numId w:val="1013"/>
+          <w:numId w:val="1014"/>
         </w:numPr>
       </w:pPr>
       <w:r>
@@ -3423,7 +3376,7 @@
         <w:pStyle w:val="Compact"/>
         <w:numPr>
           <w:ilvl w:val="0"/>
-          <w:numId w:val="1013"/>
+          <w:numId w:val="1014"/>
         </w:numPr>
       </w:pPr>
       <w:r>
@@ -3435,7 +3388,7 @@
         <w:pStyle w:val="Compact"/>
         <w:numPr>
           <w:ilvl w:val="0"/>
-          <w:numId w:val="1013"/>
+          <w:numId w:val="1014"/>
         </w:numPr>
       </w:pPr>
       <w:r>
@@ -3447,7 +3400,7 @@
         <w:pStyle w:val="Compact"/>
         <w:numPr>
           <w:ilvl w:val="0"/>
-          <w:numId w:val="1013"/>
+          <w:numId w:val="1014"/>
         </w:numPr>
       </w:pPr>
       <w:r>
@@ -3481,44 +3434,44 @@
       </w:pPr>
       <w:r>
         <w:drawing>
-          <wp:inline>
-            <wp:extent cx="5303520" cy="3683000"/>
-            <wp:effectExtent b="0" l="0" r="0" t="0"/>
-            <wp:docPr descr="" title="" id="47" name="Picture"/>
-            <a:graphic>
-              <a:graphicData uri="http://schemas.openxmlformats.org/drawingml/2006/picture">
-                <pic:pic>
-                  <pic:nvPicPr>
-                    <pic:cNvPr descr="screenshots/04-review-queue.png" id="48" name="Picture"/>
-                    <pic:cNvPicPr>
-                      <a:picLocks noChangeArrowheads="1" noChangeAspect="1"/>
-                    </pic:cNvPicPr>
-                  </pic:nvPicPr>
-                  <pic:blipFill>
-                    <a:blip r:embed="rId46"/>
-                    <a:stretch>
-                      <a:fillRect/>
-                    </a:stretch>
-                  </pic:blipFill>
-                  <pic:spPr bwMode="auto">
-                    <a:xfrm>
-                      <a:off x="0" y="0"/>
-                      <a:ext cx="5303520" cy="3683000"/>
-                    </a:xfrm>
-                    <a:prstGeom prst="rect">
-                      <a:avLst/>
-                    </a:prstGeom>
-                    <a:noFill/>
-                    <a:ln w="9525">
-                      <a:noFill/>
-                      <a:headEnd/>
-                      <a:tailEnd/>
-                    </a:ln>
-                  </pic:spPr>
-                </pic:pic>
-              </a:graphicData>
-            </a:graphic>
-          </wp:inline>
+          <ns3:inline>
+            <ns3:extent cx="5303520" cy="3683000"/>
+            <ns3:effectExtent b="0" l="0" r="0" t="0"/>
+            <ns3:docPr descr="" title="" id="47" name="Picture"/>
+            <ns4:graphic>
+              <ns4:graphicData uri="http://schemas.openxmlformats.org/drawingml/2006/picture">
+                <ns5:pic>
+                  <ns5:nvPicPr>
+                    <ns5:cNvPr descr="screenshots/04-review-queue.png" id="48" name="Picture"/>
+                    <ns5:cNvPicPr>
+                      <ns4:picLocks noChangeArrowheads="1" noChangeAspect="1"/>
+                    </ns5:cNvPicPr>
+                  </ns5:nvPicPr>
+                  <ns5:blipFill>
+                    <ns4:blip r:embed="rId46"/>
+                    <ns4:stretch>
+                      <ns4:fillRect/>
+                    </ns4:stretch>
+                  </ns5:blipFill>
+                  <ns5:spPr bwMode="auto">
+                    <ns4:xfrm>
+                      <ns4:off x="0" y="0"/>
+                      <ns4:ext cx="5303520" cy="3683000"/>
+                    </ns4:xfrm>
+                    <ns4:prstGeom prst="rect">
+                      <ns4:avLst/>
+                    </ns4:prstGeom>
+                    <ns4:noFill/>
+                    <ns4:ln w="9525">
+                      <ns4:noFill/>
+                      <ns4:headEnd/>
+                      <ns4:tailEnd/>
+                    </ns4:ln>
+                  </ns5:spPr>
+                </ns5:pic>
+              </ns4:graphicData>
+            </ns4:graphic>
+          </ns3:inline>
         </w:drawing>
       </w:r>
     </w:p>
@@ -4093,44 +4046,44 @@
       </w:pPr>
       <w:r>
         <w:drawing>
-          <wp:inline>
-            <wp:extent cx="5303520" cy="3683000"/>
-            <wp:effectExtent b="0" l="0" r="0" t="0"/>
-            <wp:docPr descr="" title="" id="53" name="Picture"/>
-            <a:graphic>
-              <a:graphicData uri="http://schemas.openxmlformats.org/drawingml/2006/picture">
-                <pic:pic>
-                  <pic:nvPicPr>
-                    <pic:cNvPr descr="screenshots/05-evaluation-dashboard.png" id="54" name="Picture"/>
-                    <pic:cNvPicPr>
-                      <a:picLocks noChangeArrowheads="1" noChangeAspect="1"/>
-                    </pic:cNvPicPr>
-                  </pic:nvPicPr>
-                  <pic:blipFill>
-                    <a:blip r:embed="rId52"/>
-                    <a:stretch>
-                      <a:fillRect/>
-                    </a:stretch>
-                  </pic:blipFill>
-                  <pic:spPr bwMode="auto">
-                    <a:xfrm>
-                      <a:off x="0" y="0"/>
-                      <a:ext cx="5303520" cy="3683000"/>
-                    </a:xfrm>
-                    <a:prstGeom prst="rect">
-                      <a:avLst/>
-                    </a:prstGeom>
-                    <a:noFill/>
-                    <a:ln w="9525">
-                      <a:noFill/>
-                      <a:headEnd/>
-                      <a:tailEnd/>
-                    </a:ln>
-                  </pic:spPr>
-                </pic:pic>
-              </a:graphicData>
-            </a:graphic>
-          </wp:inline>
+          <ns3:inline>
+            <ns3:extent cx="5303520" cy="3683000"/>
+            <ns3:effectExtent b="0" l="0" r="0" t="0"/>
+            <ns3:docPr descr="" title="" id="53" name="Picture"/>
+            <ns4:graphic>
+              <ns4:graphicData uri="http://schemas.openxmlformats.org/drawingml/2006/picture">
+                <ns5:pic>
+                  <ns5:nvPicPr>
+                    <ns5:cNvPr descr="screenshots/05-evaluation-dashboard.png" id="54" name="Picture"/>
+                    <ns5:cNvPicPr>
+                      <ns4:picLocks noChangeArrowheads="1" noChangeAspect="1"/>
+                    </ns5:cNvPicPr>
+                  </ns5:nvPicPr>
+                  <ns5:blipFill>
+                    <ns4:blip r:embed="rId52"/>
+                    <ns4:stretch>
+                      <ns4:fillRect/>
+                    </ns4:stretch>
+                  </ns5:blipFill>
+                  <ns5:spPr bwMode="auto">
+                    <ns4:xfrm>
+                      <ns4:off x="0" y="0"/>
+                      <ns4:ext cx="5303520" cy="3683000"/>
+                    </ns4:xfrm>
+                    <ns4:prstGeom prst="rect">
+                      <ns4:avLst/>
+                    </ns4:prstGeom>
+                    <ns4:noFill/>
+                    <ns4:ln w="9525">
+                      <ns4:noFill/>
+                      <ns4:headEnd/>
+                      <ns4:tailEnd/>
+                    </ns4:ln>
+                  </ns5:spPr>
+                </ns5:pic>
+              </ns4:graphicData>
+            </ns4:graphic>
+          </ns3:inline>
         </w:drawing>
       </w:r>
     </w:p>
@@ -4184,7 +4137,7 @@
         <w:pStyle w:val="Compact"/>
         <w:numPr>
           <w:ilvl w:val="0"/>
-          <w:numId w:val="1014"/>
+          <w:numId w:val="1015"/>
         </w:numPr>
       </w:pPr>
       <w:r>
@@ -4196,7 +4149,7 @@
         <w:pStyle w:val="Compact"/>
         <w:numPr>
           <w:ilvl w:val="0"/>
-          <w:numId w:val="1014"/>
+          <w:numId w:val="1015"/>
         </w:numPr>
       </w:pPr>
       <w:r>
@@ -4217,7 +4170,7 @@
         <w:pStyle w:val="Compact"/>
         <w:numPr>
           <w:ilvl w:val="0"/>
-          <w:numId w:val="1014"/>
+          <w:numId w:val="1015"/>
         </w:numPr>
       </w:pPr>
       <w:r>
@@ -4244,7 +4197,7 @@
         <w:pStyle w:val="Compact"/>
         <w:numPr>
           <w:ilvl w:val="0"/>
-          <w:numId w:val="1014"/>
+          <w:numId w:val="1015"/>
         </w:numPr>
       </w:pPr>
       <w:r>
@@ -4265,7 +4218,7 @@
         <w:pStyle w:val="Compact"/>
         <w:numPr>
           <w:ilvl w:val="0"/>
-          <w:numId w:val="1014"/>
+          <w:numId w:val="1015"/>
         </w:numPr>
       </w:pPr>
       <w:r>
@@ -4286,7 +4239,7 @@
         <w:pStyle w:val="Compact"/>
         <w:numPr>
           <w:ilvl w:val="0"/>
-          <w:numId w:val="1014"/>
+          <w:numId w:val="1015"/>
         </w:numPr>
       </w:pPr>
       <w:r>
@@ -4307,7 +4260,7 @@
         <w:pStyle w:val="Compact"/>
         <w:numPr>
           <w:ilvl w:val="0"/>
-          <w:numId w:val="1014"/>
+          <w:numId w:val="1015"/>
         </w:numPr>
       </w:pPr>
       <w:r>
@@ -4360,7 +4313,7 @@
         <w:pStyle w:val="Compact"/>
         <w:numPr>
           <w:ilvl w:val="0"/>
-          <w:numId w:val="1015"/>
+          <w:numId w:val="1016"/>
         </w:numPr>
       </w:pPr>
       <w:r>
@@ -4381,7 +4334,7 @@
         <w:pStyle w:val="Compact"/>
         <w:numPr>
           <w:ilvl w:val="0"/>
-          <w:numId w:val="1015"/>
+          <w:numId w:val="1016"/>
         </w:numPr>
       </w:pPr>
       <w:r>
@@ -4402,7 +4355,7 @@
         <w:pStyle w:val="Compact"/>
         <w:numPr>
           <w:ilvl w:val="0"/>
-          <w:numId w:val="1015"/>
+          <w:numId w:val="1016"/>
         </w:numPr>
       </w:pPr>
       <w:r>
@@ -4423,7 +4376,7 @@
         <w:pStyle w:val="Compact"/>
         <w:numPr>
           <w:ilvl w:val="0"/>
-          <w:numId w:val="1015"/>
+          <w:numId w:val="1016"/>
         </w:numPr>
       </w:pPr>
       <w:r>
@@ -4435,7 +4388,7 @@
         <w:pStyle w:val="Compact"/>
         <w:numPr>
           <w:ilvl w:val="0"/>
-          <w:numId w:val="1015"/>
+          <w:numId w:val="1016"/>
         </w:numPr>
       </w:pPr>
       <w:r>
@@ -4588,7 +4541,7 @@
         <w:pStyle w:val="Compact"/>
         <w:numPr>
           <w:ilvl w:val="0"/>
-          <w:numId w:val="1016"/>
+          <w:numId w:val="1017"/>
         </w:numPr>
       </w:pPr>
       <w:r>
@@ -4600,7 +4553,7 @@
         <w:pStyle w:val="Compact"/>
         <w:numPr>
           <w:ilvl w:val="0"/>
-          <w:numId w:val="1016"/>
+          <w:numId w:val="1017"/>
         </w:numPr>
       </w:pPr>
       <w:r>
@@ -4612,7 +4565,7 @@
         <w:pStyle w:val="Compact"/>
         <w:numPr>
           <w:ilvl w:val="0"/>
-          <w:numId w:val="1016"/>
+          <w:numId w:val="1017"/>
         </w:numPr>
       </w:pPr>
       <w:r>
@@ -4624,7 +4577,7 @@
         <w:pStyle w:val="Compact"/>
         <w:numPr>
           <w:ilvl w:val="0"/>
-          <w:numId w:val="1016"/>
+          <w:numId w:val="1017"/>
         </w:numPr>
       </w:pPr>
       <w:r>
@@ -4636,7 +4589,7 @@
         <w:pStyle w:val="Compact"/>
         <w:numPr>
           <w:ilvl w:val="0"/>
-          <w:numId w:val="1016"/>
+          <w:numId w:val="1017"/>
         </w:numPr>
       </w:pPr>
       <w:r>
@@ -4648,7 +4601,7 @@
         <w:pStyle w:val="Compact"/>
         <w:numPr>
           <w:ilvl w:val="0"/>
-          <w:numId w:val="1016"/>
+          <w:numId w:val="1017"/>
         </w:numPr>
       </w:pPr>
       <w:r>
@@ -4660,7 +4613,7 @@
         <w:pStyle w:val="Compact"/>
         <w:numPr>
           <w:ilvl w:val="0"/>
-          <w:numId w:val="1016"/>
+          <w:numId w:val="1017"/>
         </w:numPr>
       </w:pPr>
       <w:r>
@@ -4672,7 +4625,7 @@
         <w:pStyle w:val="Compact"/>
         <w:numPr>
           <w:ilvl w:val="0"/>
-          <w:numId w:val="1016"/>
+          <w:numId w:val="1017"/>
         </w:numPr>
       </w:pPr>
       <w:r>
@@ -4711,7 +4664,7 @@
         <w:pStyle w:val="Compact"/>
         <w:numPr>
           <w:ilvl w:val="0"/>
-          <w:numId w:val="1017"/>
+          <w:numId w:val="1018"/>
         </w:numPr>
       </w:pPr>
       <w:r>
@@ -4723,7 +4676,7 @@
         <w:pStyle w:val="Compact"/>
         <w:numPr>
           <w:ilvl w:val="0"/>
-          <w:numId w:val="1017"/>
+          <w:numId w:val="1018"/>
         </w:numPr>
       </w:pPr>
       <w:r>
@@ -4735,7 +4688,7 @@
         <w:pStyle w:val="Compact"/>
         <w:numPr>
           <w:ilvl w:val="0"/>
-          <w:numId w:val="1017"/>
+          <w:numId w:val="1018"/>
         </w:numPr>
       </w:pPr>
       <w:r>
@@ -4747,7 +4700,7 @@
         <w:pStyle w:val="Compact"/>
         <w:numPr>
           <w:ilvl w:val="0"/>
-          <w:numId w:val="1017"/>
+          <w:numId w:val="1018"/>
         </w:numPr>
       </w:pPr>
       <w:r>
@@ -4769,7 +4722,7 @@
         <w:pStyle w:val="Compact"/>
         <w:numPr>
           <w:ilvl w:val="0"/>
-          <w:numId w:val="1018"/>
+          <w:numId w:val="1019"/>
         </w:numPr>
       </w:pPr>
       <w:r>
@@ -4781,7 +4734,7 @@
         <w:pStyle w:val="Compact"/>
         <w:numPr>
           <w:ilvl w:val="0"/>
-          <w:numId w:val="1018"/>
+          <w:numId w:val="1019"/>
         </w:numPr>
       </w:pPr>
       <w:r>
@@ -4793,7 +4746,7 @@
         <w:pStyle w:val="Compact"/>
         <w:numPr>
           <w:ilvl w:val="0"/>
-          <w:numId w:val="1018"/>
+          <w:numId w:val="1019"/>
         </w:numPr>
       </w:pPr>
       <w:r>
@@ -4815,7 +4768,7 @@
         <w:pStyle w:val="Compact"/>
         <w:numPr>
           <w:ilvl w:val="0"/>
-          <w:numId w:val="1019"/>
+          <w:numId w:val="1020"/>
         </w:numPr>
       </w:pPr>
       <w:r>
@@ -4827,7 +4780,7 @@
         <w:pStyle w:val="Compact"/>
         <w:numPr>
           <w:ilvl w:val="0"/>
-          <w:numId w:val="1019"/>
+          <w:numId w:val="1020"/>
         </w:numPr>
       </w:pPr>
       <w:r>
@@ -4839,7 +4792,7 @@
         <w:pStyle w:val="Compact"/>
         <w:numPr>
           <w:ilvl w:val="0"/>
-          <w:numId w:val="1019"/>
+          <w:numId w:val="1020"/>
         </w:numPr>
       </w:pPr>
       <w:r>
@@ -4851,7 +4804,7 @@
         <w:pStyle w:val="Compact"/>
         <w:numPr>
           <w:ilvl w:val="0"/>
-          <w:numId w:val="1019"/>
+          <w:numId w:val="1020"/>
         </w:numPr>
       </w:pPr>
       <w:r>
@@ -4863,7 +4816,7 @@
         <w:pStyle w:val="Compact"/>
         <w:numPr>
           <w:ilvl w:val="0"/>
-          <w:numId w:val="1019"/>
+          <w:numId w:val="1020"/>
         </w:numPr>
       </w:pPr>
       <w:r>
@@ -5056,7 +5009,7 @@
         <w:pStyle w:val="Compact"/>
         <w:numPr>
           <w:ilvl w:val="0"/>
-          <w:numId w:val="1020"/>
+          <w:numId w:val="1021"/>
         </w:numPr>
       </w:pPr>
       <w:r>
@@ -5068,7 +5021,7 @@
         <w:pStyle w:val="Compact"/>
         <w:numPr>
           <w:ilvl w:val="0"/>
-          <w:numId w:val="1020"/>
+          <w:numId w:val="1021"/>
         </w:numPr>
       </w:pPr>
       <w:r>
@@ -5080,7 +5033,7 @@
         <w:pStyle w:val="Compact"/>
         <w:numPr>
           <w:ilvl w:val="0"/>
-          <w:numId w:val="1020"/>
+          <w:numId w:val="1021"/>
         </w:numPr>
       </w:pPr>
       <w:r>
@@ -5092,7 +5045,7 @@
         <w:pStyle w:val="Compact"/>
         <w:numPr>
           <w:ilvl w:val="0"/>
-          <w:numId w:val="1020"/>
+          <w:numId w:val="1021"/>
         </w:numPr>
       </w:pPr>
       <w:r>
@@ -5104,7 +5057,7 @@
         <w:pStyle w:val="Compact"/>
         <w:numPr>
           <w:ilvl w:val="0"/>
-          <w:numId w:val="1020"/>
+          <w:numId w:val="1021"/>
         </w:numPr>
       </w:pPr>
       <w:r>
@@ -5116,7 +5069,7 @@
         <w:pStyle w:val="Compact"/>
         <w:numPr>
           <w:ilvl w:val="0"/>
-          <w:numId w:val="1020"/>
+          <w:numId w:val="1021"/>
         </w:numPr>
       </w:pPr>
       <w:r>
@@ -5128,7 +5081,7 @@
         <w:pStyle w:val="Compact"/>
         <w:numPr>
           <w:ilvl w:val="0"/>
-          <w:numId w:val="1020"/>
+          <w:numId w:val="1021"/>
         </w:numPr>
       </w:pPr>
       <w:r>
@@ -5200,7 +5153,7 @@
         <w:pStyle w:val="Compact"/>
         <w:numPr>
           <w:ilvl w:val="0"/>
-          <w:numId w:val="1021"/>
+          <w:numId w:val="1022"/>
         </w:numPr>
       </w:pPr>
       <w:r>
@@ -5212,7 +5165,7 @@
         <w:pStyle w:val="Compact"/>
         <w:numPr>
           <w:ilvl w:val="0"/>
-          <w:numId w:val="1021"/>
+          <w:numId w:val="1022"/>
         </w:numPr>
       </w:pPr>
       <w:r>
@@ -5224,7 +5177,7 @@
         <w:pStyle w:val="Compact"/>
         <w:numPr>
           <w:ilvl w:val="0"/>
-          <w:numId w:val="1021"/>
+          <w:numId w:val="1022"/>
         </w:numPr>
       </w:pPr>
       <w:r>
@@ -5236,7 +5189,7 @@
         <w:pStyle w:val="Compact"/>
         <w:numPr>
           <w:ilvl w:val="0"/>
-          <w:numId w:val="1021"/>
+          <w:numId w:val="1022"/>
         </w:numPr>
       </w:pPr>
       <w:r>
@@ -5310,7 +5263,7 @@
         <w:pStyle w:val="Compact"/>
         <w:numPr>
           <w:ilvl w:val="0"/>
-          <w:numId w:val="1022"/>
+          <w:numId w:val="1023"/>
         </w:numPr>
       </w:pPr>
       <w:r>
@@ -5358,7 +5311,7 @@
         <w:pStyle w:val="Compact"/>
         <w:numPr>
           <w:ilvl w:val="0"/>
-          <w:numId w:val="1022"/>
+          <w:numId w:val="1023"/>
         </w:numPr>
       </w:pPr>
       <w:r>
@@ -5370,7 +5323,7 @@
         <w:pStyle w:val="Compact"/>
         <w:numPr>
           <w:ilvl w:val="0"/>
-          <w:numId w:val="1022"/>
+          <w:numId w:val="1023"/>
         </w:numPr>
       </w:pPr>
       <w:r>
@@ -5382,7 +5335,7 @@
         <w:pStyle w:val="Compact"/>
         <w:numPr>
           <w:ilvl w:val="0"/>
-          <w:numId w:val="1022"/>
+          <w:numId w:val="1023"/>
         </w:numPr>
       </w:pPr>
       <w:r>
@@ -5394,7 +5347,7 @@
         <w:pStyle w:val="Compact"/>
         <w:numPr>
           <w:ilvl w:val="0"/>
-          <w:numId w:val="1022"/>
+          <w:numId w:val="1023"/>
         </w:numPr>
       </w:pPr>
       <w:r>
@@ -5721,7 +5674,7 @@
         <w:pStyle w:val="Compact"/>
         <w:numPr>
           <w:ilvl w:val="0"/>
-          <w:numId w:val="1023"/>
+          <w:numId w:val="1024"/>
         </w:numPr>
       </w:pPr>
       <w:r>
@@ -5733,7 +5686,7 @@
         <w:pStyle w:val="Compact"/>
         <w:numPr>
           <w:ilvl w:val="0"/>
-          <w:numId w:val="1023"/>
+          <w:numId w:val="1024"/>
         </w:numPr>
       </w:pPr>
       <w:r>
@@ -5745,7 +5698,7 @@
         <w:pStyle w:val="Compact"/>
         <w:numPr>
           <w:ilvl w:val="0"/>
-          <w:numId w:val="1023"/>
+          <w:numId w:val="1024"/>
         </w:numPr>
       </w:pPr>
       <w:r>
@@ -5757,7 +5710,7 @@
         <w:pStyle w:val="Compact"/>
         <w:numPr>
           <w:ilvl w:val="0"/>
-          <w:numId w:val="1023"/>
+          <w:numId w:val="1024"/>
         </w:numPr>
       </w:pPr>
       <w:r>
@@ -5769,7 +5722,7 @@
         <w:pStyle w:val="Compact"/>
         <w:numPr>
           <w:ilvl w:val="0"/>
-          <w:numId w:val="1023"/>
+          <w:numId w:val="1024"/>
         </w:numPr>
       </w:pPr>
       <w:r>
@@ -5781,7 +5734,7 @@
         <w:pStyle w:val="Compact"/>
         <w:numPr>
           <w:ilvl w:val="0"/>
-          <w:numId w:val="1023"/>
+          <w:numId w:val="1024"/>
         </w:numPr>
       </w:pPr>
       <w:r>
@@ -5793,7 +5746,7 @@
         <w:pStyle w:val="Compact"/>
         <w:numPr>
           <w:ilvl w:val="0"/>
-          <w:numId w:val="1023"/>
+          <w:numId w:val="1024"/>
         </w:numPr>
       </w:pPr>
       <w:r>
@@ -5805,7 +5758,7 @@
         <w:pStyle w:val="Compact"/>
         <w:numPr>
           <w:ilvl w:val="0"/>
-          <w:numId w:val="1023"/>
+          <w:numId w:val="1024"/>
         </w:numPr>
       </w:pPr>
       <w:r>
@@ -5817,7 +5770,7 @@
         <w:pStyle w:val="Compact"/>
         <w:numPr>
           <w:ilvl w:val="0"/>
-          <w:numId w:val="1023"/>
+          <w:numId w:val="1024"/>
         </w:numPr>
       </w:pPr>
       <w:r>
@@ -5829,7 +5782,7 @@
         <w:pStyle w:val="Compact"/>
         <w:numPr>
           <w:ilvl w:val="0"/>
-          <w:numId w:val="1023"/>
+          <w:numId w:val="1024"/>
         </w:numPr>
       </w:pPr>
       <w:r>
@@ -5849,7 +5802,7 @@
         <w:pStyle w:val="Compact"/>
         <w:numPr>
           <w:ilvl w:val="0"/>
-          <w:numId w:val="1024"/>
+          <w:numId w:val="1025"/>
         </w:numPr>
       </w:pPr>
       <w:r>
@@ -5861,7 +5814,7 @@
         <w:pStyle w:val="Compact"/>
         <w:numPr>
           <w:ilvl w:val="0"/>
-          <w:numId w:val="1024"/>
+          <w:numId w:val="1025"/>
         </w:numPr>
       </w:pPr>
       <w:r>
@@ -5873,7 +5826,7 @@
         <w:pStyle w:val="Compact"/>
         <w:numPr>
           <w:ilvl w:val="0"/>
-          <w:numId w:val="1024"/>
+          <w:numId w:val="1025"/>
         </w:numPr>
       </w:pPr>
       <w:r>
@@ -5885,7 +5838,7 @@
         <w:pStyle w:val="Compact"/>
         <w:numPr>
           <w:ilvl w:val="0"/>
-          <w:numId w:val="1024"/>
+          <w:numId w:val="1025"/>
         </w:numPr>
       </w:pPr>
       <w:r>
@@ -5897,7 +5850,7 @@
         <w:pStyle w:val="Compact"/>
         <w:numPr>
           <w:ilvl w:val="0"/>
-          <w:numId w:val="1024"/>
+          <w:numId w:val="1025"/>
         </w:numPr>
       </w:pPr>
       <w:r>
@@ -5909,7 +5862,7 @@
         <w:pStyle w:val="Compact"/>
         <w:numPr>
           <w:ilvl w:val="0"/>
-          <w:numId w:val="1024"/>
+          <w:numId w:val="1025"/>
         </w:numPr>
       </w:pPr>
       <w:r>
@@ -5946,7 +5899,7 @@
         <w:pStyle w:val="Compact"/>
         <w:numPr>
           <w:ilvl w:val="0"/>
-          <w:numId w:val="1025"/>
+          <w:numId w:val="1026"/>
         </w:numPr>
       </w:pPr>
       <w:r>
@@ -5958,7 +5911,7 @@
         <w:pStyle w:val="Compact"/>
         <w:numPr>
           <w:ilvl w:val="0"/>
-          <w:numId w:val="1025"/>
+          <w:numId w:val="1026"/>
         </w:numPr>
       </w:pPr>
       <w:r>
@@ -5970,7 +5923,7 @@
         <w:pStyle w:val="Compact"/>
         <w:numPr>
           <w:ilvl w:val="0"/>
-          <w:numId w:val="1025"/>
+          <w:numId w:val="1026"/>
         </w:numPr>
       </w:pPr>
       <w:r>
@@ -5982,7 +5935,7 @@
         <w:pStyle w:val="Compact"/>
         <w:numPr>
           <w:ilvl w:val="0"/>
-          <w:numId w:val="1025"/>
+          <w:numId w:val="1026"/>
         </w:numPr>
       </w:pPr>
       <w:r>
@@ -5994,7 +5947,7 @@
         <w:pStyle w:val="Compact"/>
         <w:numPr>
           <w:ilvl w:val="0"/>
-          <w:numId w:val="1025"/>
+          <w:numId w:val="1026"/>
         </w:numPr>
       </w:pPr>
       <w:r>
@@ -6047,7 +6000,7 @@
         <w:pStyle w:val="Compact"/>
         <w:numPr>
           <w:ilvl w:val="0"/>
-          <w:numId w:val="1026"/>
+          <w:numId w:val="1027"/>
         </w:numPr>
       </w:pPr>
       <w:r>
@@ -6059,7 +6012,7 @@
         <w:pStyle w:val="Compact"/>
         <w:numPr>
           <w:ilvl w:val="0"/>
-          <w:numId w:val="1026"/>
+          <w:numId w:val="1027"/>
         </w:numPr>
       </w:pPr>
       <w:r>
@@ -6071,7 +6024,7 @@
         <w:pStyle w:val="Compact"/>
         <w:numPr>
           <w:ilvl w:val="0"/>
-          <w:numId w:val="1026"/>
+          <w:numId w:val="1027"/>
         </w:numPr>
       </w:pPr>
       <w:r>
@@ -6083,7 +6036,7 @@
         <w:pStyle w:val="Compact"/>
         <w:numPr>
           <w:ilvl w:val="0"/>
-          <w:numId w:val="1026"/>
+          <w:numId w:val="1027"/>
         </w:numPr>
       </w:pPr>
       <w:r>
@@ -6095,7 +6048,7 @@
         <w:pStyle w:val="Compact"/>
         <w:numPr>
           <w:ilvl w:val="0"/>
-          <w:numId w:val="1026"/>
+          <w:numId w:val="1027"/>
         </w:numPr>
       </w:pPr>
       <w:r>
@@ -6107,7 +6060,7 @@
         <w:pStyle w:val="Compact"/>
         <w:numPr>
           <w:ilvl w:val="0"/>
-          <w:numId w:val="1026"/>
+          <w:numId w:val="1027"/>
         </w:numPr>
       </w:pPr>
       <w:r>
@@ -6119,7 +6072,7 @@
         <w:pStyle w:val="Compact"/>
         <w:numPr>
           <w:ilvl w:val="0"/>
-          <w:numId w:val="1026"/>
+          <w:numId w:val="1027"/>
         </w:numPr>
       </w:pPr>
       <w:r>
@@ -7000,34 +6953,7 @@
     <w:abstractNumId w:val="991"/>
   </w:num>
   <w:num w:numId="1012">
-    <w:abstractNumId w:val="99411"/>
-    <w:lvlOverride w:ilvl="0">
-      <w:startOverride w:val="1"/>
-    </w:lvlOverride>
-    <w:lvlOverride w:ilvl="1">
-      <w:startOverride w:val="1"/>
-    </w:lvlOverride>
-    <w:lvlOverride w:ilvl="2">
-      <w:startOverride w:val="1"/>
-    </w:lvlOverride>
-    <w:lvlOverride w:ilvl="3">
-      <w:startOverride w:val="1"/>
-    </w:lvlOverride>
-    <w:lvlOverride w:ilvl="4">
-      <w:startOverride w:val="1"/>
-    </w:lvlOverride>
-    <w:lvlOverride w:ilvl="5">
-      <w:startOverride w:val="1"/>
-    </w:lvlOverride>
-    <w:lvlOverride w:ilvl="6">
-      <w:startOverride w:val="1"/>
-    </w:lvlOverride>
-    <w:lvlOverride w:ilvl="7">
-      <w:startOverride w:val="1"/>
-    </w:lvlOverride>
-    <w:lvlOverride w:ilvl="8">
-      <w:startOverride w:val="1"/>
-    </w:lvlOverride>
+    <w:abstractNumId w:val="991"/>
   </w:num>
   <w:num w:numId="1013">
     <w:abstractNumId w:val="99411"/>
@@ -7060,7 +6986,34 @@
     </w:lvlOverride>
   </w:num>
   <w:num w:numId="1014">
-    <w:abstractNumId w:val="991"/>
+    <w:abstractNumId w:val="99411"/>
+    <w:lvlOverride w:ilvl="0">
+      <w:startOverride w:val="1"/>
+    </w:lvlOverride>
+    <w:lvlOverride w:ilvl="1">
+      <w:startOverride w:val="1"/>
+    </w:lvlOverride>
+    <w:lvlOverride w:ilvl="2">
+      <w:startOverride w:val="1"/>
+    </w:lvlOverride>
+    <w:lvlOverride w:ilvl="3">
+      <w:startOverride w:val="1"/>
+    </w:lvlOverride>
+    <w:lvlOverride w:ilvl="4">
+      <w:startOverride w:val="1"/>
+    </w:lvlOverride>
+    <w:lvlOverride w:ilvl="5">
+      <w:startOverride w:val="1"/>
+    </w:lvlOverride>
+    <w:lvlOverride w:ilvl="6">
+      <w:startOverride w:val="1"/>
+    </w:lvlOverride>
+    <w:lvlOverride w:ilvl="7">
+      <w:startOverride w:val="1"/>
+    </w:lvlOverride>
+    <w:lvlOverride w:ilvl="8">
+      <w:startOverride w:val="1"/>
+    </w:lvlOverride>
   </w:num>
   <w:num w:numId="1015">
     <w:abstractNumId w:val="991"/>
@@ -7090,6 +7043,9 @@
     <w:abstractNumId w:val="991"/>
   </w:num>
   <w:num w:numId="1024">
+    <w:abstractNumId w:val="991"/>
+  </w:num>
+  <w:num w:numId="1025">
     <w:abstractNumId w:val="99411"/>
     <w:lvlOverride w:ilvl="0">
       <w:startOverride w:val="1"/>
@@ -7119,10 +7075,10 @@
       <w:startOverride w:val="1"/>
     </w:lvlOverride>
   </w:num>
-  <w:num w:numId="1025">
+  <w:num w:numId="1026">
     <w:abstractNumId w:val="991"/>
   </w:num>
-  <w:num w:numId="1026">
+  <w:num w:numId="1027">
     <w:abstractNumId w:val="991"/>
   </w:num>
 </w:numbering>

</xml_diff>

<commit_message>
docs: refine submission cover layout
</commit_message>
<xml_diff>
--- a/docs/DFWIT_Checkpoint2_Primary_Submission.docx
+++ b/docs/DFWIT_Checkpoint2_Primary_Submission.docx
@@ -96,14 +96,12 @@
     <w:bookmarkEnd w:id="10"/>
     <w:bookmarkEnd w:id="11"/>
     <w:bookmarkEnd w:id="12"/>
-    <w:p>
-      <w:r>
-        <w:pict>
-          <ns1:rect style="width:0;height:1.5pt" ns2:hralign="center" ns2:hrstd="t" ns2:hr="t"/>
-        </w:pict>
-      </w:r>
-    </w:p>
     <w:bookmarkStart w:id="13" w:name="executive-summary"/>
+    <w:p>
+      <w:r>
+        <w:br w:type="page"/>
+      </w:r>
+    </w:p>
     <w:p>
       <w:pPr>
         <w:pStyle w:val="Heading2"/>

</xml_diff>